<commit_message>
docs(E25): maintenance planning and constructor chapters, 8 role user guides, documentation update
- New chapters: maintenance planning (customer schedules analysis, generators, check against
  them: 91 % periodicity, peak 47 vs 62, PPR ends 23.12 vs 22.12) and constructor/extensibility.
- User guides for all 8 roles with their own screenshots (docs/guides → DOCX/PDF in
  out/Руководства), documentation 118 pages, architecture, README, ROADMAP, platform matrix,
  wiki memos for maintenance engineer and analyst.
- PPR generator: free working days spread between batches (with the remainder), 5-day buffer
  at year end — the cycle covers December like the customer's schedule.

Co-Authored-By: Claude Opus 5.5 (1M context) <noreply@anthropic.com>
</commit_message>
<xml_diff>
--- a/docs/delivery/out/Инструкция по развёртыванию.docx
+++ b/docs/delivery/out/Инструкция по развёртыванию.docx
@@ -116,7 +116,7 @@
       <w:r>
         <w:fldChar w:fldCharType="separate"/>
       </w:r>
-      <w:hyperlink w:anchor="_Toc241411720" w:history="1">
+      <w:hyperlink w:anchor="_Toc241493187" w:history="1">
         <w:r>
           <w:rPr>
             <w:rStyle w:val="aff8"/>
@@ -143,7 +143,7 @@
             <w:noProof/>
             <w:webHidden/>
           </w:rPr>
-          <w:instrText xml:space="preserve"> PAGEREF _Toc241411720 \h </w:instrText>
+          <w:instrText xml:space="preserve"> PAGEREF _Toc241493187 \h </w:instrText>
         </w:r>
         <w:r>
           <w:rPr>
@@ -186,7 +186,7 @@
           <w:lang w:val="ru-RU" w:eastAsia="ru-RU"/>
         </w:rPr>
       </w:pPr>
-      <w:hyperlink w:anchor="_Toc241411721" w:history="1">
+      <w:hyperlink w:anchor="_Toc241493188" w:history="1">
         <w:r>
           <w:rPr>
             <w:rStyle w:val="aff8"/>
@@ -213,7 +213,7 @@
             <w:noProof/>
             <w:webHidden/>
           </w:rPr>
-          <w:instrText xml:space="preserve"> PAGEREF _Toc241411721 \h </w:instrText>
+          <w:instrText xml:space="preserve"> PAGEREF _Toc241493188 \h </w:instrText>
         </w:r>
         <w:r>
           <w:rPr>
@@ -256,7 +256,7 @@
           <w:lang w:val="ru-RU" w:eastAsia="ru-RU"/>
         </w:rPr>
       </w:pPr>
-      <w:hyperlink w:anchor="_Toc241411722" w:history="1">
+      <w:hyperlink w:anchor="_Toc241493189" w:history="1">
         <w:r>
           <w:rPr>
             <w:rStyle w:val="aff8"/>
@@ -283,7 +283,7 @@
             <w:noProof/>
             <w:webHidden/>
           </w:rPr>
-          <w:instrText xml:space="preserve"> PAGEREF _Toc241411722 \h </w:instrText>
+          <w:instrText xml:space="preserve"> PAGEREF _Toc241493189 \h </w:instrText>
         </w:r>
         <w:r>
           <w:rPr>
@@ -326,7 +326,7 @@
           <w:lang w:val="ru-RU" w:eastAsia="ru-RU"/>
         </w:rPr>
       </w:pPr>
-      <w:hyperlink w:anchor="_Toc241411723" w:history="1">
+      <w:hyperlink w:anchor="_Toc241493190" w:history="1">
         <w:r>
           <w:rPr>
             <w:rStyle w:val="aff8"/>
@@ -353,7 +353,7 @@
             <w:noProof/>
             <w:webHidden/>
           </w:rPr>
-          <w:instrText xml:space="preserve"> PAGEREF _Toc241411723 \h </w:instrText>
+          <w:instrText xml:space="preserve"> PAGEREF _Toc241493190 \h </w:instrText>
         </w:r>
         <w:r>
           <w:rPr>
@@ -396,7 +396,7 @@
           <w:lang w:val="ru-RU" w:eastAsia="ru-RU"/>
         </w:rPr>
       </w:pPr>
-      <w:hyperlink w:anchor="_Toc241411724" w:history="1">
+      <w:hyperlink w:anchor="_Toc241493191" w:history="1">
         <w:r>
           <w:rPr>
             <w:rStyle w:val="aff8"/>
@@ -423,7 +423,7 @@
             <w:noProof/>
             <w:webHidden/>
           </w:rPr>
-          <w:instrText xml:space="preserve"> PAGEREF _Toc241411724 \h </w:instrText>
+          <w:instrText xml:space="preserve"> PAGEREF _Toc241493191 \h </w:instrText>
         </w:r>
         <w:r>
           <w:rPr>
@@ -466,7 +466,7 @@
           <w:lang w:val="ru-RU" w:eastAsia="ru-RU"/>
         </w:rPr>
       </w:pPr>
-      <w:hyperlink w:anchor="_Toc241411725" w:history="1">
+      <w:hyperlink w:anchor="_Toc241493192" w:history="1">
         <w:r>
           <w:rPr>
             <w:rStyle w:val="aff8"/>
@@ -493,7 +493,7 @@
             <w:noProof/>
             <w:webHidden/>
           </w:rPr>
-          <w:instrText xml:space="preserve"> PAGEREF _Toc241411725 \h </w:instrText>
+          <w:instrText xml:space="preserve"> PAGEREF _Toc241493192 \h </w:instrText>
         </w:r>
         <w:r>
           <w:rPr>
@@ -536,7 +536,7 @@
           <w:lang w:val="ru-RU" w:eastAsia="ru-RU"/>
         </w:rPr>
       </w:pPr>
-      <w:hyperlink w:anchor="_Toc241411726" w:history="1">
+      <w:hyperlink w:anchor="_Toc241493193" w:history="1">
         <w:r>
           <w:rPr>
             <w:rStyle w:val="aff8"/>
@@ -563,7 +563,7 @@
             <w:noProof/>
             <w:webHidden/>
           </w:rPr>
-          <w:instrText xml:space="preserve"> PAGEREF _Toc241411726 \h </w:instrText>
+          <w:instrText xml:space="preserve"> PAGEREF _Toc241493193 \h </w:instrText>
         </w:r>
         <w:r>
           <w:rPr>
@@ -606,7 +606,7 @@
           <w:lang w:val="ru-RU" w:eastAsia="ru-RU"/>
         </w:rPr>
       </w:pPr>
-      <w:hyperlink w:anchor="_Toc241411727" w:history="1">
+      <w:hyperlink w:anchor="_Toc241493194" w:history="1">
         <w:r>
           <w:rPr>
             <w:rStyle w:val="aff8"/>
@@ -633,7 +633,7 @@
             <w:noProof/>
             <w:webHidden/>
           </w:rPr>
-          <w:instrText xml:space="preserve"> PAGEREF _Toc241411727 \h </w:instrText>
+          <w:instrText xml:space="preserve"> PAGEREF _Toc241493194 \h </w:instrText>
         </w:r>
         <w:r>
           <w:rPr>
@@ -676,7 +676,7 @@
           <w:lang w:val="ru-RU" w:eastAsia="ru-RU"/>
         </w:rPr>
       </w:pPr>
-      <w:hyperlink w:anchor="_Toc241411728" w:history="1">
+      <w:hyperlink w:anchor="_Toc241493195" w:history="1">
         <w:r>
           <w:rPr>
             <w:rStyle w:val="aff8"/>
@@ -703,7 +703,7 @@
             <w:noProof/>
             <w:webHidden/>
           </w:rPr>
-          <w:instrText xml:space="preserve"> PAGEREF _Toc241411728 \h </w:instrText>
+          <w:instrText xml:space="preserve"> PAGEREF _Toc241493195 \h </w:instrText>
         </w:r>
         <w:r>
           <w:rPr>
@@ -746,7 +746,7 @@
           <w:lang w:val="ru-RU" w:eastAsia="ru-RU"/>
         </w:rPr>
       </w:pPr>
-      <w:hyperlink w:anchor="_Toc241411729" w:history="1">
+      <w:hyperlink w:anchor="_Toc241493196" w:history="1">
         <w:r>
           <w:rPr>
             <w:rStyle w:val="aff8"/>
@@ -773,7 +773,7 @@
             <w:noProof/>
             <w:webHidden/>
           </w:rPr>
-          <w:instrText xml:space="preserve"> PAGEREF _Toc241411729 \h </w:instrText>
+          <w:instrText xml:space="preserve"> PAGEREF _Toc241493196 \h </w:instrText>
         </w:r>
         <w:r>
           <w:rPr>
@@ -816,7 +816,7 @@
           <w:lang w:val="ru-RU" w:eastAsia="ru-RU"/>
         </w:rPr>
       </w:pPr>
-      <w:hyperlink w:anchor="_Toc241411730" w:history="1">
+      <w:hyperlink w:anchor="_Toc241493197" w:history="1">
         <w:r>
           <w:rPr>
             <w:rStyle w:val="aff8"/>
@@ -843,7 +843,7 @@
             <w:noProof/>
             <w:webHidden/>
           </w:rPr>
-          <w:instrText xml:space="preserve"> PAGEREF _Toc241411730 \h </w:instrText>
+          <w:instrText xml:space="preserve"> PAGEREF _Toc241493197 \h </w:instrText>
         </w:r>
         <w:r>
           <w:rPr>
@@ -886,7 +886,7 @@
           <w:lang w:val="ru-RU" w:eastAsia="ru-RU"/>
         </w:rPr>
       </w:pPr>
-      <w:hyperlink w:anchor="_Toc241411731" w:history="1">
+      <w:hyperlink w:anchor="_Toc241493198" w:history="1">
         <w:r>
           <w:rPr>
             <w:rStyle w:val="aff8"/>
@@ -913,7 +913,7 @@
             <w:noProof/>
             <w:webHidden/>
           </w:rPr>
-          <w:instrText xml:space="preserve"> PAGEREF _Toc241411731 \h </w:instrText>
+          <w:instrText xml:space="preserve"> PAGEREF _Toc241493198 \h </w:instrText>
         </w:r>
         <w:r>
           <w:rPr>
@@ -933,7 +933,7 @@
             <w:noProof/>
             <w:webHidden/>
           </w:rPr>
-          <w:t>11</w:t>
+          <w:t>12</w:t>
         </w:r>
         <w:r>
           <w:rPr>
@@ -958,7 +958,7 @@
       <w:pPr>
         <w:pStyle w:val="1"/>
       </w:pPr>
-      <w:bookmarkStart w:id="0" w:name="_Toc241411720"/>
+      <w:bookmarkStart w:id="0" w:name="_Toc241493187"/>
       <w:r>
         <w:lastRenderedPageBreak/>
         <w:t>Развёртывание на серверах заказчика</w:t>
@@ -1340,7 +1340,7 @@
       <w:pPr>
         <w:pStyle w:val="21"/>
       </w:pPr>
-      <w:bookmarkStart w:id="1" w:name="_Toc241411721"/>
+      <w:bookmarkStart w:id="1" w:name="_Toc241493188"/>
       <w:r>
         <w:t>1. Что понадобится</w:t>
       </w:r>
@@ -2114,7 +2114,7 @@
               <w:rPr>
                 <w:sz w:val="18"/>
               </w:rPr>
-              <w:t>пользователи учебного контура</w:t>
+              <w:t>пользователи по старым закладкам</w:t>
             </w:r>
           </w:p>
         </w:tc>
@@ -2127,7 +2127,20 @@
               <w:rPr>
                 <w:sz w:val="18"/>
               </w:rPr>
-              <w:t>учебный контур, если он включён</w:t>
+              <w:t xml:space="preserve">перенаправление в учебный контур </w:t>
+            </w:r>
+            <w:r>
+              <w:rPr>
+                <w:rFonts w:ascii="Consolas" w:hAnsi="Consolas"/>
+                <w:sz w:val="16"/>
+              </w:rPr>
+              <w:t>/training/</w:t>
+            </w:r>
+            <w:r>
+              <w:rPr>
+                <w:sz w:val="18"/>
+              </w:rPr>
+              <w:t xml:space="preserve"> (можно не публиковать)</w:t>
             </w:r>
           </w:p>
         </w:tc>
@@ -2171,7 +2184,13 @@
               <w:rPr>
                 <w:sz w:val="18"/>
               </w:rPr>
-              <w:t>внешний слушатель Kafka</w:t>
+              <w:t xml:space="preserve">внешний </w:t>
+            </w:r>
+            <w:r>
+              <w:rPr>
+                <w:sz w:val="18"/>
+              </w:rPr>
+              <w:t>слушатель Kafka</w:t>
             </w:r>
           </w:p>
         </w:tc>
@@ -2180,17 +2199,17 @@
     <w:p/>
     <w:p>
       <w:r>
-        <w:t xml:space="preserve">База, Redis, Kafka </w:t>
-      </w:r>
-      <w:r>
-        <w:t>(внутренний слушатель), Prometheus и экспортеры наружу не публикуются. Kafka UI в контуре заказчика не запускается. Исходящие соединения системе не нужны. Исключения — по решению заказчика: тайлы карты, Overpass и погода (раздел 6).</w:t>
+        <w:t>База, Redis, Kafka (внутренний слушатель), Prometheus и экспортеры наружу не публикуются. Kafka UI в контуре заказчика не запускается. Исходящие соединения системе не нужны. Исключения — по решению заказчика: тайлы карты, Overpass и погод</w:t>
+      </w:r>
+      <w:r>
+        <w:t>а (раздел 6).</w:t>
       </w:r>
     </w:p>
     <w:p>
       <w:pPr>
         <w:pStyle w:val="21"/>
       </w:pPr>
-      <w:bookmarkStart w:id="2" w:name="_Toc241411722"/>
+      <w:bookmarkStart w:id="2" w:name="_Toc241493189"/>
       <w:r>
         <w:t>2. Доставка на сервер</w:t>
       </w:r>
@@ -2201,10 +2220,7 @@
         <w:pStyle w:val="31"/>
       </w:pPr>
       <w:r>
-        <w:t>В</w:t>
-      </w:r>
-      <w:r>
-        <w:t>ариант А: у сервера есть доступ в интернет</w:t>
+        <w:t>Вариант А: у сервера есть доступ в интернет</w:t>
       </w:r>
     </w:p>
     <w:tbl>
@@ -2258,15 +2274,15 @@
         <w:pStyle w:val="31"/>
       </w:pPr>
       <w:r>
-        <w:t>Вариант Б: закрытый контур</w:t>
+        <w:t xml:space="preserve">Вариант Б: </w:t>
+      </w:r>
+      <w:r>
+        <w:t>закрытый контур</w:t>
       </w:r>
     </w:p>
     <w:p>
       <w:r>
-        <w:t xml:space="preserve">На машине с </w:t>
-      </w:r>
-      <w:r>
-        <w:t>интернетом и Docker, из корня репозитория:</w:t>
+        <w:t>На машине с интернетом и Docker, из корня репозитория:</w:t>
       </w:r>
     </w:p>
     <w:tbl>
@@ -2338,13 +2354,17 @@
           <w:rFonts w:ascii="Consolas" w:hAnsi="Consolas"/>
           <w:sz w:val="20"/>
         </w:rPr>
-        <w:t>collector-src-&lt;версия&gt;.tar.gz</w:t>
-      </w:r>
-      <w:r>
-        <w:t xml:space="preserve"> — файлы развёртывания: com</w:t>
-      </w:r>
-      <w:r>
-        <w:t xml:space="preserve">pose, </w:t>
+        <w:t>collector-src-&lt;версия&gt;.tar.g</w:t>
+      </w:r>
+      <w:r>
+        <w:rPr>
+          <w:rFonts w:ascii="Consolas" w:hAnsi="Consolas"/>
+          <w:sz w:val="20"/>
+        </w:rPr>
+        <w:t>z</w:t>
+      </w:r>
+      <w:r>
+        <w:t xml:space="preserve"> — файлы развёртывания: compose, </w:t>
       </w:r>
       <w:r>
         <w:rPr>
@@ -2416,22 +2436,22 @@
                 <w:sz w:val="17"/>
               </w:rPr>
               <w:br/>
-              <w:t>docker load -i collector-images-&lt;версия&gt;.tar.gz</w:t>
+              <w:t>docker load -i collecto</w:t>
             </w:r>
             <w:r>
               <w:rPr>
                 <w:rFonts w:ascii="Consolas" w:hAnsi="Consolas"/>
                 <w:sz w:val="17"/>
               </w:rPr>
-              <w:br/>
-              <w:t xml:space="preserve">cd </w:t>
+              <w:t>r-images-&lt;версия&gt;.tar.gz</w:t>
             </w:r>
             <w:r>
               <w:rPr>
                 <w:rFonts w:ascii="Consolas" w:hAnsi="Consolas"/>
                 <w:sz w:val="17"/>
               </w:rPr>
-              <w:t>/opt/collector &amp;&amp; cp .env.example .env</w:t>
+              <w:br/>
+              <w:t>cd /opt/collector &amp;&amp; cp .env.example .env</w:t>
             </w:r>
           </w:p>
         </w:tc>
@@ -2467,10 +2487,13 @@
       <w:pPr>
         <w:pStyle w:val="21"/>
       </w:pPr>
-      <w:bookmarkStart w:id="3" w:name="_Toc241411723"/>
+      <w:bookmarkStart w:id="3" w:name="_Toc241493190"/>
       <w:r>
         <w:lastRenderedPageBreak/>
-        <w:t>3. Состав каталога на сервере</w:t>
+        <w:t xml:space="preserve">3. Состав каталога </w:t>
+      </w:r>
+      <w:r>
+        <w:t>на сервере</w:t>
       </w:r>
       <w:bookmarkEnd w:id="3"/>
     </w:p>
@@ -2541,14 +2564,7 @@
                 <w:b/>
                 <w:sz w:val="18"/>
               </w:rPr>
-              <w:t>Резервир</w:t>
-            </w:r>
-            <w:r>
-              <w:rPr>
-                <w:b/>
-                <w:sz w:val="18"/>
-              </w:rPr>
-              <w:t>овать</w:t>
+              <w:t>Резервировать</w:t>
             </w:r>
           </w:p>
         </w:tc>
@@ -2715,7 +2731,13 @@
               <w:rPr>
                 <w:sz w:val="18"/>
               </w:rPr>
-              <w:t>ежедневные копии базы</w:t>
+              <w:t xml:space="preserve">ежедневные копии </w:t>
+            </w:r>
+            <w:r>
+              <w:rPr>
+                <w:sz w:val="18"/>
+              </w:rPr>
+              <w:t>базы</w:t>
             </w:r>
           </w:p>
         </w:tc>
@@ -2728,13 +2750,7 @@
               <w:rPr>
                 <w:sz w:val="18"/>
               </w:rPr>
-              <w:t xml:space="preserve">копировать на </w:t>
-            </w:r>
-            <w:r>
-              <w:rPr>
-                <w:sz w:val="18"/>
-              </w:rPr>
-              <w:t>отдельное хранилище</w:t>
+              <w:t>копировать на отдельное хранилище</w:t>
             </w:r>
           </w:p>
         </w:tc>
@@ -2835,7 +2851,7 @@
       <w:pPr>
         <w:pStyle w:val="21"/>
       </w:pPr>
-      <w:bookmarkStart w:id="4" w:name="_Toc241411724"/>
+      <w:bookmarkStart w:id="4" w:name="_Toc241493191"/>
       <w:r>
         <w:t>4. Настройка</w:t>
       </w:r>
@@ -3449,7 +3465,7 @@
                 <w:rFonts w:ascii="Consolas" w:hAnsi="Consolas"/>
                 <w:sz w:val="16"/>
               </w:rPr>
-              <w:t>COMBAT_URL</w:t>
+              <w:t>TLS</w:t>
             </w:r>
           </w:p>
         </w:tc>
@@ -3463,53 +3479,27 @@
                 <w:rFonts w:ascii="Consolas" w:hAnsi="Consolas"/>
                 <w:sz w:val="16"/>
               </w:rPr>
-              <w:t>https://forecast.corp.local</w:t>
-            </w:r>
-          </w:p>
-        </w:tc>
-      </w:tr>
-      <w:tr>
-        <w:trPr>
-          <w:jc w:val="center"/>
-        </w:trPr>
-        <w:tc>
-          <w:tcPr>
-            <w:tcW w:w="4819" w:type="dxa"/>
-          </w:tcPr>
-          <w:p>
+              <w:t>internal</w:t>
+            </w:r>
+            <w:r>
+              <w:rPr>
+                <w:sz w:val="18"/>
+              </w:rPr>
+              <w:t xml:space="preserve"> или </w:t>
+            </w:r>
             <w:r>
               <w:rPr>
                 <w:rFonts w:ascii="Consolas" w:hAnsi="Consolas"/>
                 <w:sz w:val="16"/>
               </w:rPr>
-              <w:t>TLS</w:t>
-            </w:r>
-          </w:p>
-        </w:tc>
-        <w:tc>
-          <w:tcPr>
-            <w:tcW w:w="4819" w:type="dxa"/>
-          </w:tcPr>
-          <w:p>
+              <w:t xml:space="preserve">/certs/fullchain.pem </w:t>
+            </w:r>
             <w:r>
               <w:rPr>
                 <w:rFonts w:ascii="Consolas" w:hAnsi="Consolas"/>
                 <w:sz w:val="16"/>
               </w:rPr>
-              <w:t>internal</w:t>
-            </w:r>
-            <w:r>
-              <w:rPr>
-                <w:sz w:val="18"/>
-              </w:rPr>
-              <w:t xml:space="preserve"> или </w:t>
-            </w:r>
-            <w:r>
-              <w:rPr>
-                <w:rFonts w:ascii="Consolas" w:hAnsi="Consolas"/>
-                <w:sz w:val="16"/>
-              </w:rPr>
-              <w:t>/certs/fullchain.pem /certs/privkey.pem</w:t>
+              <w:t>/certs/privkey.pem</w:t>
             </w:r>
           </w:p>
         </w:tc>
@@ -3568,11 +3558,7 @@
         <w:t>TLS=internal</w:t>
       </w:r>
       <w:r>
-        <w:t xml:space="preserve"> Caddy выпускает сертификат своим ЦС. </w:t>
-      </w:r>
-      <w:r>
-        <w:lastRenderedPageBreak/>
-        <w:t xml:space="preserve">Тогда корневой сертификат из тома </w:t>
+        <w:t xml:space="preserve"> Caddy выпускает сертификат своим ЦС. Тогда корневой сертификат из тома </w:t>
       </w:r>
       <w:r>
         <w:rPr>
@@ -3589,10 +3575,21 @@
           <w:rFonts w:ascii="Consolas" w:hAnsi="Consolas"/>
           <w:sz w:val="20"/>
         </w:rPr>
-        <w:t>/data/caddy/pki/authorities/local/root.crt</w:t>
-      </w:r>
-      <w:r>
-        <w:t xml:space="preserve">) раздаётся на рабочие места через групповые политики. Сертификат должен покрывать </w:t>
+        <w:t>/data</w:t>
+      </w:r>
+      <w:r>
+        <w:rPr>
+          <w:rFonts w:ascii="Consolas" w:hAnsi="Consolas"/>
+          <w:sz w:val="20"/>
+        </w:rPr>
+        <w:t>/caddy/pki/authorities/local/root.crt</w:t>
+      </w:r>
+      <w:r>
+        <w:t xml:space="preserve">) </w:t>
+      </w:r>
+      <w:r>
+        <w:lastRenderedPageBreak/>
+        <w:t xml:space="preserve">раздаётся на рабочие места через групповые политики. Сертификат должен покрывать </w:t>
       </w:r>
       <w:r>
         <w:rPr>
@@ -3602,10 +3599,17 @@
         <w:t>SITE_ADDRESS</w:t>
       </w:r>
       <w:r>
-        <w:t>, а если включён учебный контур — то</w:t>
-      </w:r>
-      <w:r>
-        <w:t xml:space="preserve"> же имя на порту 8443.</w:t>
+        <w:t>, Учебный контур работает на том же имени (</w:t>
+      </w:r>
+      <w:r>
+        <w:rPr>
+          <w:rFonts w:ascii="Consolas" w:hAnsi="Consolas"/>
+          <w:sz w:val="20"/>
+        </w:rPr>
+        <w:t>/training/</w:t>
+      </w:r>
+      <w:r>
+        <w:t>), отдельный сертификат ему не нужен.</w:t>
       </w:r>
     </w:p>
     <w:p>
@@ -3867,7 +3871,14 @@
                 <w:rFonts w:ascii="Consolas" w:hAnsi="Consolas"/>
                 <w:sz w:val="16"/>
               </w:rPr>
-              <w:t>LDAP_BIND_PASSWORD</w:t>
+              <w:t>LDAP_</w:t>
+            </w:r>
+            <w:r>
+              <w:rPr>
+                <w:rFonts w:ascii="Consolas" w:hAnsi="Consolas"/>
+                <w:sz w:val="16"/>
+              </w:rPr>
+              <w:t>BIND_PASSWORD</w:t>
             </w:r>
           </w:p>
         </w:tc>
@@ -3979,14 +3990,7 @@
                 <w:rFonts w:ascii="Consolas" w:hAnsi="Consolas"/>
                 <w:sz w:val="16"/>
               </w:rPr>
-              <w:t>OU=Forecast,OU=Groups</w:t>
-            </w:r>
-            <w:r>
-              <w:rPr>
-                <w:rFonts w:ascii="Consolas" w:hAnsi="Consolas"/>
-                <w:sz w:val="16"/>
-              </w:rPr>
-              <w:t>,DC=corp,DC=local</w:t>
+              <w:t>OU=Forecast,OU=Groups,DC=corp,DC=local</w:t>
             </w:r>
             <w:r>
               <w:rPr>
@@ -4994,13 +4998,7 @@
               <w:rPr>
                 <w:sz w:val="18"/>
               </w:rPr>
-              <w:t>ре</w:t>
-            </w:r>
-            <w:r>
-              <w:rPr>
-                <w:sz w:val="18"/>
-              </w:rPr>
-              <w:t xml:space="preserve">естр оборудования: </w:t>
+              <w:t xml:space="preserve">реестр оборудования: </w:t>
             </w:r>
             <w:r>
               <w:rPr>
@@ -5187,7 +5185,13 @@
               <w:rPr>
                 <w:sz w:val="18"/>
               </w:rPr>
-              <w:t>пароль роли БД только для чтения, под которой Grafana читает витрины (раздел 6.8)</w:t>
+              <w:t xml:space="preserve">пароль роли БД только для чтения, под которой Grafana читает витрины </w:t>
+            </w:r>
+            <w:r>
+              <w:rPr>
+                <w:sz w:val="18"/>
+              </w:rPr>
+              <w:t>(раздел 6.8)</w:t>
             </w:r>
           </w:p>
         </w:tc>
@@ -5198,12 +5202,9 @@
       <w:pPr>
         <w:pStyle w:val="21"/>
       </w:pPr>
-      <w:bookmarkStart w:id="5" w:name="_Toc241411725"/>
-      <w:r>
-        <w:t>5.</w:t>
-      </w:r>
-      <w:r>
-        <w:t xml:space="preserve"> Первый запуск</w:t>
+      <w:bookmarkStart w:id="5" w:name="_Toc241493192"/>
+      <w:r>
+        <w:t>5. Первый запуск</w:t>
       </w:r>
       <w:bookmarkEnd w:id="5"/>
     </w:p>
@@ -5281,10 +5282,7 @@
         <w:pStyle w:val="a0"/>
       </w:pPr>
       <w:r>
-        <w:t xml:space="preserve">создаёт роли и </w:t>
-      </w:r>
-      <w:r>
-        <w:t>права, таксономию состояний, политики эскалации, уровни риска, справочник причин решений, правила разметки, расписания и статьи вики;</w:t>
+        <w:t>создаёт роли и права, таксономию состояний, политики эскалации, уровни риска, справочник причин решений, правила разметки, расписания и статьи вики;</w:t>
       </w:r>
     </w:p>
     <w:p>
@@ -5292,7 +5290,10 @@
         <w:pStyle w:val="a0"/>
       </w:pPr>
       <w:r>
-        <w:t xml:space="preserve">загружает справочники объектов и каналов, если они лежат в </w:t>
+        <w:t>загружает справочники объектов и</w:t>
+      </w:r>
+      <w:r>
+        <w:t xml:space="preserve"> каналов, если они лежат в </w:t>
       </w:r>
       <w:r>
         <w:rPr>
@@ -5315,10 +5316,7 @@
     </w:p>
     <w:p>
       <w:r>
-        <w:t>Все шаги идемпот</w:t>
-      </w:r>
-      <w:r>
-        <w:t>ентны: повторный запуск ничего не дублирует и не затирает правки.</w:t>
+        <w:t>Все шаги идемпотентны: повторный запуск ничего не дублирует и не затирает правки.</w:t>
       </w:r>
     </w:p>
     <w:p>
@@ -5400,7 +5398,10 @@
     <w:p>
       <w:r>
         <w:lastRenderedPageBreak/>
-        <w:t xml:space="preserve">Все строки должны быть </w:t>
+        <w:t>Все строки д</w:t>
+      </w:r>
+      <w:r>
+        <w:t xml:space="preserve">олжны быть </w:t>
       </w:r>
       <w:r>
         <w:rPr>
@@ -5443,10 +5444,7 @@
         <w:t>data/dataset/journals/</w:t>
       </w:r>
       <w:r>
-        <w:t>, в том же формате, что выгрузка для стенда. Дальше — и</w:t>
-      </w:r>
-      <w:r>
-        <w:t>з интерфейса («Загрузка данных», роль «Аналитик» или «Администратор») или из консоли:</w:t>
+        <w:t>, в том же формате, что выгрузка для стенда. Дальше — из интерфейса («Загрузка данных», роль «Аналитик» или «Администратор») или из консоли:</w:t>
       </w:r>
     </w:p>
     <w:tbl>
@@ -5472,22 +5470,22 @@
                 <w:rFonts w:ascii="Consolas" w:hAnsi="Consolas"/>
                 <w:sz w:val="17"/>
               </w:rPr>
-              <w:t>docker compose run --rm backend python manage.py import_history            # все годы, кроме 2021</w:t>
+              <w:t>docker compos</w:t>
             </w:r>
             <w:r>
               <w:rPr>
                 <w:rFonts w:ascii="Consolas" w:hAnsi="Consolas"/>
                 <w:sz w:val="17"/>
               </w:rPr>
-              <w:br/>
-              <w:t xml:space="preserve">docker compose exec worker python manage.py train_model --task gas      </w:t>
+              <w:t>e run --rm backend python manage.py import_history            # все годы, кроме 2021</w:t>
             </w:r>
             <w:r>
               <w:rPr>
                 <w:rFonts w:ascii="Consolas" w:hAnsi="Consolas"/>
                 <w:sz w:val="17"/>
               </w:rPr>
-              <w:t xml:space="preserve">    # и --task flood</w:t>
+              <w:br/>
+              <w:t>docker compose exec worker python manage.py train_model --task gas          # и --task flood</w:t>
             </w:r>
             <w:r>
               <w:rPr>
@@ -5504,10 +5502,10 @@
     <w:p/>
     <w:p>
       <w:r>
-        <w:t>Импорт занимает 1–2 минуты на год журнала, пиковая память — около 2,3 ГБ. После импорта модель отказа датчиков обучается автоматически (модели газа и подтопления — командами выше),</w:t>
-      </w:r>
-      <w:r>
-        <w:t xml:space="preserve"> дальше прогноз пересчитывается каждые 15 минут.</w:t>
+        <w:t>Импорт занимает 1–2 мин</w:t>
+      </w:r>
+      <w:r>
+        <w:t>уты на год журнала, пиковая память — около 2,3 ГБ. После импорта модель отказа датчиков обучается автоматически (модели газа и подтопления — командами выше), дальше прогноз пересчитывается каждые 15 минут.</w:t>
       </w:r>
     </w:p>
     <w:p>
@@ -5520,7 +5518,10 @@
     </w:p>
     <w:p>
       <w:r>
-        <w:t>Администратор или руководитель района:</w:t>
+        <w:t xml:space="preserve">Администратор или </w:t>
+      </w:r>
+      <w:r>
+        <w:t>руководитель района:</w:t>
       </w:r>
     </w:p>
     <w:p>
@@ -5576,10 +5577,10 @@
         <w:t>Объекты на карте</w:t>
       </w:r>
       <w:r>
-        <w:t xml:space="preserve"> («Зоны и объекты» → «Объекты»): у каждого объекта из справочника задаётся контур. Щелчок по зданию выделяет контур автоматически (если подключена подложка или Overpass), и</w:t>
-      </w:r>
-      <w:r>
-        <w:t>наче контур обводится вручную. В справочниках заказчика координат нет, поэтому это обязательный шаг для карты мониторинга.</w:t>
+        <w:t xml:space="preserve"> («Зоны и объекты» → «Объекты»): у каждого объект</w:t>
+      </w:r>
+      <w:r>
+        <w:t>а из справочника задаётся контур. Щелчок по зданию выделяет контур автоматически (если подключена подложка или Overpass), иначе контур обводится вручную. В справочниках заказчика координат нет, поэтому это обязательный шаг для карты мониторинга.</w:t>
       </w:r>
     </w:p>
     <w:p>
@@ -5598,17 +5599,14 @@
     </w:p>
     <w:p>
       <w:r>
-        <w:t>Схем</w:t>
-      </w:r>
-      <w:r>
-        <w:t>а по пикетам, прогнозы и карточки работают и без контуров: они нужны только для карты.</w:t>
+        <w:t>Схема по пикетам, прогнозы и карточки работают и без контуров: они нужны только для карты.</w:t>
       </w:r>
     </w:p>
     <w:p>
       <w:pPr>
         <w:pStyle w:val="21"/>
       </w:pPr>
-      <w:bookmarkStart w:id="6" w:name="_Toc241411726"/>
+      <w:bookmarkStart w:id="6" w:name="_Toc241493193"/>
       <w:r>
         <w:t>6. Подключение источников</w:t>
       </w:r>
@@ -5624,7 +5622,10 @@
     </w:p>
     <w:p>
       <w:r>
-        <w:t xml:space="preserve">Шлюз СМВУ публикует события в Kafka </w:t>
+        <w:t xml:space="preserve">Шлюз </w:t>
+      </w:r>
+      <w:r>
+        <w:t xml:space="preserve">СМВУ публикует события в Kafka </w:t>
       </w:r>
       <w:r>
         <w:rPr>
@@ -5644,10 +5645,7 @@
         <w:t>smvu.raw-events</w:t>
       </w:r>
       <w:r>
-        <w:t xml:space="preserve">. Одно сообщение — одно событие канала в JSON </w:t>
-      </w:r>
-      <w:r>
-        <w:t>(UTF-8). Ключ сообщения — ид канала:</w:t>
+        <w:t>. Одно сообщение — одно событие канала в JSON (UTF-8). Ключ сообщения — ид канала:</w:t>
       </w:r>
     </w:p>
     <w:tbl>
@@ -5681,7 +5679,14 @@
                 <w:sz w:val="17"/>
               </w:rPr>
               <w:br/>
-              <w:t xml:space="preserve"> "raw_value": "0.8", "raw_alarm": false, "source": "smvu"}</w:t>
+              <w:t xml:space="preserve"> "raw_val</w:t>
+            </w:r>
+            <w:r>
+              <w:rPr>
+                <w:rFonts w:ascii="Consolas" w:hAnsi="Consolas"/>
+                <w:sz w:val="17"/>
+              </w:rPr>
+              <w:t>ue": "0.8", "raw_alarm": false, "source": "smvu"}</w:t>
             </w:r>
           </w:p>
         </w:tc>
@@ -5768,13 +5773,7 @@
               <w:rPr>
                 <w:sz w:val="18"/>
               </w:rPr>
-              <w:t xml:space="preserve">уникальный номер события в СМВУ </w:t>
-            </w:r>
-            <w:r>
-              <w:rPr>
-                <w:sz w:val="18"/>
-              </w:rPr>
-              <w:t>(повторная доставка не создаёт дублей)</w:t>
+              <w:t>уникальный номер события в СМВУ (повторная доставка не создаёт дублей)</w:t>
             </w:r>
           </w:p>
         </w:tc>
@@ -5902,13 +5901,7 @@
               <w:rPr>
                 <w:sz w:val="18"/>
               </w:rPr>
-              <w:t xml:space="preserve">признак </w:t>
-            </w:r>
-            <w:r>
-              <w:rPr>
-                <w:sz w:val="18"/>
-              </w:rPr>
-              <w:t>тревоги, если СМВУ его передаёт</w:t>
+              <w:t>признак тревоги, если СМВУ его передаёт</w:t>
             </w:r>
           </w:p>
         </w:tc>
@@ -5917,7 +5910,10 @@
     <w:p/>
     <w:p>
       <w:r>
-        <w:t xml:space="preserve">Проверка: в Grafana (системный дашборд) растёт число принятых событий, а задержка потока держится в пределах секунд. Журнал приёма: </w:t>
+        <w:t>Проверка: в Grafana (системный дашборд) растёт число принятых событий, а задержка потока держится в пределах секунд</w:t>
+      </w:r>
+      <w:r>
+        <w:t xml:space="preserve">. Журнал приёма: </w:t>
       </w:r>
       <w:r>
         <w:rPr>
@@ -5950,7 +5946,14 @@
           <w:rFonts w:ascii="Consolas" w:hAnsi="Consolas"/>
           <w:sz w:val="20"/>
         </w:rPr>
-        <w:t>infra/deploy/docker-compose.customer.yml</w:t>
+        <w:t>infra/deploy/docker-</w:t>
+      </w:r>
+      <w:r>
+        <w:rPr>
+          <w:rFonts w:ascii="Consolas" w:hAnsi="Consolas"/>
+          <w:sz w:val="20"/>
+        </w:rPr>
+        <w:t>compose.customer.yml</w:t>
       </w:r>
       <w:r>
         <w:t xml:space="preserve"> переводится на </w:t>
@@ -5970,14 +5973,7 @@
           <w:rFonts w:ascii="Consolas" w:hAnsi="Consolas"/>
           <w:sz w:val="20"/>
         </w:rPr>
-        <w:t>SASL_S</w:t>
-      </w:r>
-      <w:r>
-        <w:rPr>
-          <w:rFonts w:ascii="Consolas" w:hAnsi="Consolas"/>
-          <w:sz w:val="20"/>
-        </w:rPr>
-        <w:t>SL</w:t>
+        <w:t>SASL_SSL</w:t>
       </w:r>
       <w:r>
         <w:t>.</w:t>
@@ -6001,15 +5997,15 @@
         <w:pStyle w:val="31"/>
       </w:pPr>
       <w:r>
-        <w:t>6.3 Карта мониторинга в закрытом контуре</w:t>
+        <w:t xml:space="preserve">6.3 Карта мониторинга в закрытом </w:t>
+      </w:r>
+      <w:r>
+        <w:t>контуре</w:t>
       </w:r>
     </w:p>
     <w:p>
       <w:r>
-        <w:t xml:space="preserve">Подложка — векторные тайлы OpenStreetMap, </w:t>
-      </w:r>
-      <w:r>
-        <w:t>их запрашивает браузер пользователя. Варианты:</w:t>
+        <w:t>Подложка — векторные тайлы OpenStreetMap, их запрашивает браузер пользователя. Варианты:</w:t>
       </w:r>
     </w:p>
     <w:tbl>
@@ -6187,7 +6183,14 @@
                 <w:rFonts w:ascii="Consolas" w:hAnsi="Consolas"/>
                 <w:sz w:val="16"/>
               </w:rPr>
-              <w:t>MAP_STYLE_LIGHT/DARK</w:t>
+              <w:t>MAP_ST</w:t>
+            </w:r>
+            <w:r>
+              <w:rPr>
+                <w:rFonts w:ascii="Consolas" w:hAnsi="Consolas"/>
+                <w:sz w:val="16"/>
+              </w:rPr>
+              <w:t>YLE_LIGHT/DARK</w:t>
             </w:r>
             <w:r>
               <w:rPr>
@@ -6202,10 +6205,7 @@
     <w:p/>
     <w:p>
       <w:r>
-        <w:t xml:space="preserve">Автовыделение здания берёт контур прямо из подложки, поэтому со своим </w:t>
-      </w:r>
-      <w:r>
-        <w:t>сервером тайлов оно работает без Overpass. Overpass (</w:t>
+        <w:t>Автовыделение здания берёт контур прямо из подложки, поэтому со своим сервером тайлов оно работает без Overpass. Overpass (</w:t>
       </w:r>
       <w:r>
         <w:rPr>
@@ -6215,7 +6215,10 @@
         <w:t>OVERPASS_URL</w:t>
       </w:r>
       <w:r>
-        <w:t>) — запасной путь, его запросы идут с сервера. Если подложки нет, контуры объектов обводятся вручную.</w:t>
+        <w:t>) — запасной путь, его запросы идут с сервера. Е</w:t>
+      </w:r>
+      <w:r>
+        <w:t>сли подложки нет, контуры объектов обводятся вручную.</w:t>
       </w:r>
     </w:p>
     <w:p>
@@ -6230,10 +6233,7 @@
         <w:t>docker compose up -d</w:t>
       </w:r>
       <w:r>
-        <w:t>: пересоздадутся контейнеры</w:t>
-      </w:r>
-      <w:r>
-        <w:t xml:space="preserve"> с изменённым окружением.</w:t>
+        <w:t>: пересоздадутся контейнеры с изменённым окружением.</w:t>
       </w:r>
     </w:p>
     <w:p>
@@ -6246,7 +6246,10 @@
     </w:p>
     <w:p>
       <w:r>
-        <w:t xml:space="preserve">Погоду раз в 6 часов загружает задача «Погода Open-Meteo» — ей нужен доступ сервера к </w:t>
+        <w:t xml:space="preserve">Погоду раз в 6 часов загружает задача «Погода Open-Meteo» — ей нужен доступ </w:t>
+      </w:r>
+      <w:r>
+        <w:t xml:space="preserve">сервера к </w:t>
       </w:r>
       <w:r>
         <w:rPr>
@@ -6256,10 +6259,7 @@
         <w:t>archive-api.open-meteo.com</w:t>
       </w:r>
       <w:r>
-        <w:t>. Без интернета задача выключается в админке: «Periodic tasks» → снять «Enabled». Модели работают и без пог</w:t>
-      </w:r>
-      <w:r>
-        <w:t>оды, прирост от неё в пределах шума.</w:t>
+        <w:t>. Без интернета задача выключается в админке: «Periodic tasks» → снять «Enabled». Модели работают и без погоды, прирост от неё в пределах шума.</w:t>
       </w:r>
     </w:p>
     <w:p>
@@ -6332,22 +6332,22 @@
                 <w:sz w:val="17"/>
               </w:rPr>
               <w:br/>
-              <w:t>HELPDESK_AUT</w:t>
+              <w:t>HELPDESK_AUTH_SCHEME=Token                      # Bearer | Token | Basic</w:t>
             </w:r>
             <w:r>
               <w:rPr>
                 <w:rFonts w:ascii="Consolas" w:hAnsi="Consolas"/>
                 <w:sz w:val="17"/>
               </w:rPr>
-              <w:t>H_SCHEME=Token                      # Bearer | Token | Basic</w:t>
+              <w:br/>
+              <w:t>H</w:t>
             </w:r>
             <w:r>
               <w:rPr>
                 <w:rFonts w:ascii="Consolas" w:hAnsi="Consolas"/>
                 <w:sz w:val="17"/>
               </w:rPr>
-              <w:br/>
-              <w:t>HELPDESK_SUBMIT_PATH=/api/tickets/</w:t>
+              <w:t>ELPDESK_SUBMIT_PATH=/api/tickets/</w:t>
             </w:r>
             <w:r>
               <w:rPr>
@@ -6371,14 +6371,7 @@
                 <w:sz w:val="17"/>
               </w:rPr>
               <w:br/>
-              <w:t>HELPDESK_CA_CERT=/certs/cor</w:t>
-            </w:r>
-            <w:r>
-              <w:rPr>
-                <w:rFonts w:ascii="Consolas" w:hAnsi="Consolas"/>
-                <w:sz w:val="17"/>
-              </w:rPr>
-              <w:t>p-ca.pem</w:t>
+              <w:t>HELPDESK_CA_CERT=/certs/corp-ca.pem</w:t>
             </w:r>
           </w:p>
         </w:tc>
@@ -6394,7 +6387,14 @@
           <w:rFonts w:ascii="Consolas" w:hAnsi="Consolas"/>
           <w:sz w:val="20"/>
         </w:rPr>
-        <w:t>docs/integrations.md</w:t>
+        <w:t>docs</w:t>
+      </w:r>
+      <w:r>
+        <w:rPr>
+          <w:rFonts w:ascii="Consolas" w:hAnsi="Consolas"/>
+          <w:sz w:val="20"/>
+        </w:rPr>
+        <w:t>/integrations.md</w:t>
       </w:r>
       <w:r>
         <w:t xml:space="preserve">. Если система не готова, укажите </w:t>
@@ -6415,10 +6415,7 @@
         <w:pStyle w:val="31"/>
       </w:pPr>
       <w:r>
-        <w:t>6.6 Реестр оборудован</w:t>
-      </w:r>
-      <w:r>
-        <w:t>ия</w:t>
+        <w:t>6.6 Реестр оборудования</w:t>
       </w:r>
     </w:p>
     <w:p>
@@ -6444,7 +6441,14 @@
           <w:rFonts w:ascii="Consolas" w:hAnsi="Consolas"/>
           <w:sz w:val="20"/>
         </w:rPr>
-        <w:t>REGISTRY_URL</w:t>
+        <w:t>REGI</w:t>
+      </w:r>
+      <w:r>
+        <w:rPr>
+          <w:rFonts w:ascii="Consolas" w:hAnsi="Consolas"/>
+          <w:sz w:val="20"/>
+        </w:rPr>
+        <w:t>STRY_URL</w:t>
       </w:r>
       <w:r>
         <w:t xml:space="preserve">, </w:t>
@@ -6480,10 +6484,10 @@
     </w:p>
     <w:p>
       <w:r>
-        <w:t>Камеры заводятся в администрировании («Камеры видеонаблюдения»): объект, пикет, ид камеры</w:t>
-      </w:r>
-      <w:r>
-        <w:t xml:space="preserve"> в системе видеонаблюдения. Подключение VMS заказчика:</w:t>
+        <w:t>Камеры заводятся в администрировании («Камеры видеонаблюдения»): объект, пикет, ид камеры в системе видеонаблюде</w:t>
+      </w:r>
+      <w:r>
+        <w:t>ния. Подключение VMS заказчика:</w:t>
       </w:r>
     </w:p>
     <w:tbl>
@@ -6541,14 +6545,7 @@
                 <w:sz w:val="17"/>
               </w:rPr>
               <w:br/>
-              <w:t>VMS_LIVE_URL=https://vms.corp.loc</w:t>
-            </w:r>
-            <w:r>
-              <w:rPr>
-                <w:rFonts w:ascii="Consolas" w:hAnsi="Consolas"/>
-                <w:sz w:val="17"/>
-              </w:rPr>
-              <w:t>al/live/{id}?t={at}</w:t>
+              <w:t>VMS_LIVE_URL=https://vms.corp.local/live/{id}?t={at}</w:t>
             </w:r>
           </w:p>
         </w:tc>
@@ -6557,7 +6554,10 @@
     <w:p/>
     <w:p>
       <w:r>
-        <w:t xml:space="preserve">Сервис </w:t>
+        <w:t>С</w:t>
+      </w:r>
+      <w:r>
+        <w:t xml:space="preserve">ервис </w:t>
       </w:r>
       <w:r>
         <w:rPr>
@@ -6600,10 +6600,10 @@
     </w:p>
     <w:p>
       <w:r>
-        <w:t xml:space="preserve">Вход — через учётную запись системы. Администратор видит всё, аналитик — бизнес-панели. </w:t>
-      </w:r>
-      <w:r>
-        <w:t xml:space="preserve">Форма входа Grafana выключена. Пароль </w:t>
+        <w:t>Вход — через учётную запись системы. Администратор видит всё, аналитик — бизнес-панели. Форма входа Grafana вык</w:t>
+      </w:r>
+      <w:r>
+        <w:t xml:space="preserve">лючена. Пароль </w:t>
       </w:r>
       <w:r>
         <w:rPr>
@@ -6640,14 +6640,7 @@
           <w:rFonts w:ascii="Consolas" w:hAnsi="Consolas"/>
           <w:sz w:val="20"/>
         </w:rPr>
-        <w:t>GRAFANA_DB_PASSWOR</w:t>
-      </w:r>
-      <w:r>
-        <w:rPr>
-          <w:rFonts w:ascii="Consolas" w:hAnsi="Consolas"/>
-          <w:sz w:val="20"/>
-        </w:rPr>
-        <w:t>D</w:t>
+        <w:t>GRAFANA_DB_PASSWORD</w:t>
       </w:r>
       <w:r>
         <w:t xml:space="preserve"> в </w:t>
@@ -6660,7 +6653,10 @@
         <w:t>.env</w:t>
       </w:r>
       <w:r>
-        <w:t xml:space="preserve"> до первого запуска или перезапустите </w:t>
+        <w:t xml:space="preserve"> до первого зап</w:t>
+      </w:r>
+      <w:r>
+        <w:t xml:space="preserve">уска или перезапустите </w:t>
       </w:r>
       <w:r>
         <w:rPr>
@@ -6687,7 +6683,7 @@
       <w:pPr>
         <w:pStyle w:val="21"/>
       </w:pPr>
-      <w:bookmarkStart w:id="7" w:name="_Toc241411727"/>
+      <w:bookmarkStart w:id="7" w:name="_Toc241493194"/>
       <w:r>
         <w:t>7. Учебный контур</w:t>
       </w:r>
@@ -6695,7 +6691,30 @@
     </w:p>
     <w:p>
       <w:r>
-        <w:t>Отдельная база, Redis, тема Kafka и help desk. Боевые данные он не видит:</w:t>
+        <w:t>Подсистема на том же адресе: https://forecast.corp.local/training/. Своя база, Redis, тема Kafka и help desk, боевые данные ей не видны. Вход и учётные записи общие с основной с</w:t>
+      </w:r>
+      <w:r>
+        <w:t>истемой: учебный контур читает их из её базы (</w:t>
+      </w:r>
+      <w:r>
+        <w:rPr>
+          <w:rFonts w:ascii="Consolas" w:hAnsi="Consolas"/>
+          <w:sz w:val="20"/>
+        </w:rPr>
+        <w:t>IDENTITY_DATABASE_URL</w:t>
+      </w:r>
+      <w:r>
+        <w:t xml:space="preserve"> задан в </w:t>
+      </w:r>
+      <w:r>
+        <w:rPr>
+          <w:rFonts w:ascii="Consolas" w:hAnsi="Consolas"/>
+          <w:sz w:val="20"/>
+        </w:rPr>
+        <w:t>docker-compose.yml</w:t>
+      </w:r>
+      <w:r>
+        <w:t>), отдельно заводить пользователей не нужно (см. главу «Единая платформа»).</w:t>
       </w:r>
     </w:p>
     <w:tbl>
@@ -6721,21 +6740,6 @@
                 <w:rFonts w:ascii="Consolas" w:hAnsi="Consolas"/>
                 <w:sz w:val="17"/>
               </w:rPr>
-              <w:t xml:space="preserve"># в .env: </w:t>
-            </w:r>
-            <w:r>
-              <w:rPr>
-                <w:rFonts w:ascii="Consolas" w:hAnsi="Consolas"/>
-                <w:sz w:val="17"/>
-              </w:rPr>
-              <w:t>TRAINING_ADDRESS=forecast.corp.local:8443, TRAINING_URL=https://forecast.corp.local:8443</w:t>
-            </w:r>
-            <w:r>
-              <w:rPr>
-                <w:rFonts w:ascii="Consolas" w:hAnsi="Consolas"/>
-                <w:sz w:val="17"/>
-              </w:rPr>
-              <w:br/>
               <w:t>docker compose --profile training up -d</w:t>
             </w:r>
           </w:p>
@@ -6743,6 +6747,61 @@
       </w:tr>
     </w:tbl>
     <w:p/>
+    <w:p>
+      <w:r>
+        <w:rPr>
+          <w:rFonts w:ascii="Consolas" w:hAnsi="Consolas"/>
+          <w:sz w:val="20"/>
+        </w:rPr>
+        <w:t>TRAINING_ADDRESS</w:t>
+      </w:r>
+      <w:r>
+        <w:t xml:space="preserve"> нужен, только чтобы старые </w:t>
+      </w:r>
+      <w:r>
+        <w:t xml:space="preserve">закладки </w:t>
+      </w:r>
+      <w:r>
+        <w:rPr>
+          <w:rFonts w:ascii="Consolas" w:hAnsi="Consolas"/>
+          <w:sz w:val="20"/>
+        </w:rPr>
+        <w:t>:8443</w:t>
+      </w:r>
+      <w:r>
+        <w:t xml:space="preserve"> перенаправлялись в </w:t>
+      </w:r>
+      <w:r>
+        <w:rPr>
+          <w:rFonts w:ascii="Consolas" w:hAnsi="Consolas"/>
+          <w:sz w:val="20"/>
+        </w:rPr>
+        <w:t>/training/</w:t>
+      </w:r>
+      <w:r>
+        <w:t xml:space="preserve">. Переменные </w:t>
+      </w:r>
+      <w:r>
+        <w:rPr>
+          <w:rFonts w:ascii="Consolas" w:hAnsi="Consolas"/>
+          <w:sz w:val="20"/>
+        </w:rPr>
+        <w:t>COMBAT_URL</w:t>
+      </w:r>
+      <w:r>
+        <w:t xml:space="preserve"> и </w:t>
+      </w:r>
+      <w:r>
+        <w:rPr>
+          <w:rFonts w:ascii="Consolas" w:hAnsi="Consolas"/>
+          <w:sz w:val="20"/>
+        </w:rPr>
+        <w:t>TRAINING_URL</w:t>
+      </w:r>
+      <w:r>
+        <w:t xml:space="preserve"> больше не используются.</w:t>
+      </w:r>
+    </w:p>
     <w:p>
       <w:r>
         <w:t xml:space="preserve">Симулятор датчиков слушает только </w:t>
@@ -6762,14 +6821,7 @@
           <w:rFonts w:ascii="Consolas" w:hAnsi="Consolas"/>
           <w:sz w:val="20"/>
         </w:rPr>
-        <w:t xml:space="preserve">ssh -L 8095:127.0.0.1:8095 </w:t>
-      </w:r>
-      <w:r>
-        <w:rPr>
-          <w:rFonts w:ascii="Consolas" w:hAnsi="Consolas"/>
-          <w:sz w:val="20"/>
-        </w:rPr>
-        <w:t>&lt;сервер&gt;</w:t>
+        <w:t>ssh -L 8095:127.0.0.1:8095 &lt;сервер&gt;</w:t>
       </w:r>
       <w:r>
         <w:t>.</w:t>
@@ -6779,9 +6831,12 @@
       <w:pPr>
         <w:pStyle w:val="21"/>
       </w:pPr>
-      <w:bookmarkStart w:id="8" w:name="_Toc241411728"/>
-      <w:r>
-        <w:t>8. Обновление</w:t>
+      <w:bookmarkStart w:id="8" w:name="_Toc241493195"/>
+      <w:r>
+        <w:t xml:space="preserve">8. </w:t>
+      </w:r>
+      <w:r>
+        <w:t>Обновление</w:t>
       </w:r>
       <w:bookmarkEnd w:id="8"/>
     </w:p>
@@ -6832,14 +6887,14 @@
                 <w:sz w:val="17"/>
               </w:rPr>
               <w:br/>
-              <w:t xml:space="preserve">  docker tag collector-forecast/$i:local collector-fo</w:t>
+              <w:t xml:space="preserve">  docker tag collector-forecast/$i:local collector-forecast/$i:pre</w:t>
             </w:r>
             <w:r>
               <w:rPr>
                 <w:rFonts w:ascii="Consolas" w:hAnsi="Consolas"/>
                 <w:sz w:val="17"/>
               </w:rPr>
-              <w:t>recast/$i:prev</w:t>
+              <w:t>v</w:t>
             </w:r>
             <w:r>
               <w:rPr>
@@ -6871,22 +6926,22 @@
                 <w:sz w:val="17"/>
               </w:rPr>
               <w:br/>
-              <w:t>docker compose up -d                                      # migrate применит новые мигра</w:t>
+              <w:t>docker compose up -d                                      # migrate применит новые миграции</w:t>
             </w:r>
             <w:r>
               <w:rPr>
                 <w:rFonts w:ascii="Consolas" w:hAnsi="Consolas"/>
                 <w:sz w:val="17"/>
               </w:rPr>
-              <w:t>ции</w:t>
+              <w:br/>
+              <w:t>infra/dep</w:t>
             </w:r>
             <w:r>
               <w:rPr>
                 <w:rFonts w:ascii="Consolas" w:hAnsi="Consolas"/>
                 <w:sz w:val="17"/>
               </w:rPr>
-              <w:br/>
-              <w:t>infra/deploy/check.sh https://forecast.corp.local</w:t>
+              <w:t>loy/check.sh https://forecast.corp.local</w:t>
             </w:r>
           </w:p>
         </w:tc>
@@ -6895,6 +6950,7 @@
     <w:p/>
     <w:p>
       <w:r>
+        <w:lastRenderedPageBreak/>
         <w:t>Перерыв в работе — около минуты, пока пересоздаются контейнеры. Сторонние образы меняются только вместе с версией системы.</w:t>
       </w:r>
     </w:p>
@@ -6936,21 +6992,17 @@
         <w:t>docker compose up -d</w:t>
       </w:r>
       <w:r>
-        <w:t>. Если нов</w:t>
-      </w:r>
-      <w:r>
-        <w:t xml:space="preserve">ая версия применила миграции, базу восстанавливают из копии, сделанной перед обновлением. Порядок </w:t>
-      </w:r>
-      <w:r>
-        <w:lastRenderedPageBreak/>
-        <w:t>восстановления — в главе «Резервное копирование и восстановление» сопроводительной документации.</w:t>
+        <w:t>. Если новая версия при</w:t>
+      </w:r>
+      <w:r>
+        <w:t>менила миграции, базу восстанавливают из копии, сделанной перед обновлением. Порядок восстановления — в главе «Резервное копирование и восстановление» сопроводительной документации.</w:t>
       </w:r>
     </w:p>
     <w:p>
       <w:pPr>
         <w:pStyle w:val="21"/>
       </w:pPr>
-      <w:bookmarkStart w:id="9" w:name="_Toc241411729"/>
+      <w:bookmarkStart w:id="9" w:name="_Toc241493196"/>
       <w:r>
         <w:t>9. Эксплуатация</w:t>
       </w:r>
@@ -6977,10 +7029,7 @@
         <w:t>backup</w:t>
       </w:r>
       <w:r>
-        <w:t xml:space="preserve"> каждые сутк</w:t>
-      </w:r>
-      <w:r>
-        <w:t xml:space="preserve">и делает </w:t>
+        <w:t xml:space="preserve"> каждые сутки делает </w:t>
       </w:r>
       <w:r>
         <w:rPr>
@@ -7051,17 +7100,13 @@
           <w:rFonts w:ascii="Consolas" w:hAnsi="Consolas"/>
           <w:sz w:val="20"/>
         </w:rPr>
-        <w:t>https://&lt;сервер&gt;/graf</w:t>
-      </w:r>
-      <w:r>
-        <w:rPr>
-          <w:rFonts w:ascii="Consolas" w:hAnsi="Consolas"/>
-          <w:sz w:val="20"/>
-        </w:rPr>
-        <w:t>ana/</w:t>
-      </w:r>
-      <w:r>
-        <w:t>: системный дашборд (контейнеры, база, поток, очереди) и «Бизнес-показатели». Prometheus хранит метрики 15 суток.</w:t>
+        <w:t>https://&lt;сервер&gt;/grafana/</w:t>
+      </w:r>
+      <w:r>
+        <w:t>: сис</w:t>
+      </w:r>
+      <w:r>
+        <w:t>темный дашборд (контейнеры, база, поток, очереди) и «Бизнес-показатели». Prometheus хранит метрики 15 суток.</w:t>
       </w:r>
     </w:p>
     <w:p>
@@ -7099,7 +7144,10 @@
         <w:t>Расписание задач</w:t>
       </w:r>
       <w:r>
-        <w:t xml:space="preserve"> меняется в админке («Periodic tasks») без перезапуска.</w:t>
+        <w:t xml:space="preserve"> меняет</w:t>
+      </w:r>
+      <w:r>
+        <w:t>ся в админке («Periodic tasks») без перезапуска.</w:t>
       </w:r>
     </w:p>
     <w:p>
@@ -7140,12 +7188,9 @@
       <w:pPr>
         <w:pStyle w:val="21"/>
       </w:pPr>
-      <w:bookmarkStart w:id="10" w:name="_Toc241411730"/>
-      <w:r>
-        <w:t>10. Ти</w:t>
-      </w:r>
-      <w:r>
-        <w:t>пичные проблемы</w:t>
+      <w:bookmarkStart w:id="10" w:name="_Toc241493197"/>
+      <w:r>
+        <w:t>10. Типичные проблемы</w:t>
       </w:r>
       <w:bookmarkEnd w:id="10"/>
     </w:p>
@@ -7318,13 +7363,13 @@
               <w:rPr>
                 <w:sz w:val="18"/>
               </w:rPr>
-              <w:t xml:space="preserve">Вход работает, но формы админки </w:t>
-            </w:r>
-            <w:r>
-              <w:rPr>
-                <w:sz w:val="18"/>
-              </w:rPr>
-              <w:t>отвечают «CSRF verification failed»</w:t>
+              <w:t xml:space="preserve">Вход работает, но формы админки отвечают «CSRF </w:t>
+            </w:r>
+            <w:r>
+              <w:rPr>
+                <w:sz w:val="18"/>
+              </w:rPr>
+              <w:t>verification failed»</w:t>
             </w:r>
           </w:p>
         </w:tc>
@@ -7420,14 +7465,14 @@
                 <w:rFonts w:ascii="Consolas" w:hAnsi="Consolas"/>
                 <w:sz w:val="16"/>
               </w:rPr>
-              <w:t>cer</w:t>
+              <w:t>certificate verify</w:t>
             </w:r>
             <w:r>
               <w:rPr>
                 <w:rFonts w:ascii="Consolas" w:hAnsi="Consolas"/>
                 <w:sz w:val="16"/>
               </w:rPr>
-              <w:t>tificate verify failed</w:t>
+              <w:t xml:space="preserve"> failed</w:t>
             </w:r>
           </w:p>
         </w:tc>
@@ -7491,13 +7536,7 @@
               <w:rPr>
                 <w:sz w:val="18"/>
               </w:rPr>
-              <w:t xml:space="preserve"> (пишется в ж</w:t>
-            </w:r>
-            <w:r>
-              <w:rPr>
-                <w:sz w:val="18"/>
-              </w:rPr>
-              <w:t>урнал действий)</w:t>
+              <w:t xml:space="preserve"> (пишется в журнал действий)</w:t>
             </w:r>
           </w:p>
         </w:tc>
@@ -7648,13 +7687,7 @@
               <w:rPr>
                 <w:sz w:val="18"/>
               </w:rPr>
-              <w:t xml:space="preserve">Интерфейс открывается, уведомления не </w:t>
-            </w:r>
-            <w:r>
-              <w:rPr>
-                <w:sz w:val="18"/>
-              </w:rPr>
-              <w:t>приходят</w:t>
+              <w:t>Интерфейс открывается, уведомления не приходят</w:t>
             </w:r>
           </w:p>
         </w:tc>
@@ -7667,7 +7700,13 @@
               <w:rPr>
                 <w:sz w:val="18"/>
               </w:rPr>
-              <w:t>прокси между пользователями и сервером режет WebSocket (</w:t>
+              <w:t xml:space="preserve">прокси между пользователями и сервером режет </w:t>
+            </w:r>
+            <w:r>
+              <w:rPr>
+                <w:sz w:val="18"/>
+              </w:rPr>
+              <w:t>WebSocket (</w:t>
             </w:r>
             <w:r>
               <w:rPr>
@@ -7691,8 +7730,9 @@
       <w:pPr>
         <w:pStyle w:val="21"/>
       </w:pPr>
-      <w:bookmarkStart w:id="11" w:name="_Toc241411731"/>
-      <w:r>
+      <w:bookmarkStart w:id="11" w:name="_Toc241493198"/>
+      <w:r>
+        <w:lastRenderedPageBreak/>
         <w:t>11. Перед вводом в эксплуатацию</w:t>
       </w:r>
       <w:bookmarkEnd w:id="11"/>
@@ -7753,7 +7793,10 @@
         <w:t>check.sh</w:t>
       </w:r>
       <w:r>
-        <w:t xml:space="preserve"> — все строки </w:t>
+        <w:t xml:space="preserve"> — все ст</w:t>
+      </w:r>
+      <w:r>
+        <w:t xml:space="preserve">роки </w:t>
       </w:r>
       <w:r>
         <w:rPr>
@@ -7771,7 +7814,6 @@
         <w:pStyle w:val="a"/>
       </w:pPr>
       <w:r>
-        <w:lastRenderedPageBreak/>
         <w:t>Имя сервера и сертификат заказчика; корневой сертификат доверен на рабочих местах.</w:t>
       </w:r>
     </w:p>
@@ -7790,10 +7832,7 @@
         <w:t>ldaps://</w:t>
       </w:r>
       <w:r>
-        <w:t xml:space="preserve"> или StartTLS, сервисная учётная запись только на чтение, гру</w:t>
-      </w:r>
-      <w:r>
-        <w:t>ппы ролей в отдельной OU.</w:t>
+        <w:t xml:space="preserve"> или StartTLS, сервисная учётная запись только на чтение, группы ролей в отдельной OU.</w:t>
       </w:r>
     </w:p>
     <w:p>
@@ -7801,7 +7840,10 @@
         <w:pStyle w:val="a"/>
       </w:pPr>
       <w:r>
-        <w:t>Порт 9094 открыт только для шлюза СМВУ, 443 и 8443 — только из сети предприятия или VPN.</w:t>
+        <w:t>Порт 9094 открыт только для шлюза СМВУ, 443 (и 8443, есл</w:t>
+      </w:r>
+      <w:r>
+        <w:t>и оставлен для старых закладок) — только из сети предприятия или VPN.</w:t>
       </w:r>
     </w:p>
     <w:p>
@@ -7817,10 +7859,7 @@
         <w:pStyle w:val="a"/>
       </w:pPr>
       <w:r>
-        <w:t>Резервные копии уходят на отдельное хранилище и шифруются</w:t>
-      </w:r>
-      <w:r>
-        <w:t>, пробное восстановление выполнено.</w:t>
+        <w:t>Резервные копии уходят на отдельное хранилище и шифруются, пробное восстановление выполнено.</w:t>
       </w:r>
     </w:p>
     <w:p>
@@ -7828,7 +7867,10 @@
         <w:pStyle w:val="a"/>
       </w:pPr>
       <w:r>
-        <w:t xml:space="preserve">Решено, откуда карта берёт подложку, и настроены </w:t>
+        <w:t>Решено, о</w:t>
+      </w:r>
+      <w:r>
+        <w:t xml:space="preserve">ткуда карта берёт подложку, и настроены </w:t>
       </w:r>
       <w:r>
         <w:rPr>
@@ -19555,7 +19597,7 @@
     <w:autoRedefine/>
     <w:uiPriority w:val="39"/>
     <w:unhideWhenUsed/>
-    <w:rsid w:val="009A0F04"/>
+    <w:rsid w:val="005D4262"/>
     <w:pPr>
       <w:spacing w:after="100"/>
     </w:pPr>
@@ -19567,7 +19609,7 @@
     <w:autoRedefine/>
     <w:uiPriority w:val="39"/>
     <w:unhideWhenUsed/>
-    <w:rsid w:val="009A0F04"/>
+    <w:rsid w:val="005D4262"/>
     <w:pPr>
       <w:spacing w:after="100"/>
       <w:ind w:left="220"/>
@@ -19578,7 +19620,7 @@
     <w:basedOn w:val="a2"/>
     <w:uiPriority w:val="99"/>
     <w:unhideWhenUsed/>
-    <w:rsid w:val="009A0F04"/>
+    <w:rsid w:val="005D4262"/>
     <w:rPr>
       <w:color w:val="0000FF" w:themeColor="hyperlink"/>
       <w:u w:val="single"/>

</xml_diff>

<commit_message>
docs: rebuild documentation with updated test count
Co-Authored-By: Claude Opus 5.5 (1M context) <noreply@anthropic.com>
</commit_message>
<xml_diff>
--- a/docs/delivery/out/Инструкция по развёртыванию.docx
+++ b/docs/delivery/out/Инструкция по развёртыванию.docx
@@ -116,7 +116,7 @@
       <w:r>
         <w:fldChar w:fldCharType="separate"/>
       </w:r>
-      <w:hyperlink w:anchor="_Toc241493187" w:history="1">
+      <w:hyperlink w:anchor="_Toc241494086" w:history="1">
         <w:r>
           <w:rPr>
             <w:rStyle w:val="aff8"/>
@@ -143,7 +143,7 @@
             <w:noProof/>
             <w:webHidden/>
           </w:rPr>
-          <w:instrText xml:space="preserve"> PAGEREF _Toc241493187 \h </w:instrText>
+          <w:instrText xml:space="preserve"> PAGEREF _Toc241494086 \h </w:instrText>
         </w:r>
         <w:r>
           <w:rPr>
@@ -186,7 +186,7 @@
           <w:lang w:val="ru-RU" w:eastAsia="ru-RU"/>
         </w:rPr>
       </w:pPr>
-      <w:hyperlink w:anchor="_Toc241493188" w:history="1">
+      <w:hyperlink w:anchor="_Toc241494087" w:history="1">
         <w:r>
           <w:rPr>
             <w:rStyle w:val="aff8"/>
@@ -213,7 +213,7 @@
             <w:noProof/>
             <w:webHidden/>
           </w:rPr>
-          <w:instrText xml:space="preserve"> PAGEREF _Toc241493188 \h </w:instrText>
+          <w:instrText xml:space="preserve"> PAGEREF _Toc241494087 \h </w:instrText>
         </w:r>
         <w:r>
           <w:rPr>
@@ -256,7 +256,7 @@
           <w:lang w:val="ru-RU" w:eastAsia="ru-RU"/>
         </w:rPr>
       </w:pPr>
-      <w:hyperlink w:anchor="_Toc241493189" w:history="1">
+      <w:hyperlink w:anchor="_Toc241494088" w:history="1">
         <w:r>
           <w:rPr>
             <w:rStyle w:val="aff8"/>
@@ -283,7 +283,7 @@
             <w:noProof/>
             <w:webHidden/>
           </w:rPr>
-          <w:instrText xml:space="preserve"> PAGEREF _Toc241493189 \h </w:instrText>
+          <w:instrText xml:space="preserve"> PAGEREF _Toc241494088 \h </w:instrText>
         </w:r>
         <w:r>
           <w:rPr>
@@ -326,7 +326,7 @@
           <w:lang w:val="ru-RU" w:eastAsia="ru-RU"/>
         </w:rPr>
       </w:pPr>
-      <w:hyperlink w:anchor="_Toc241493190" w:history="1">
+      <w:hyperlink w:anchor="_Toc241494089" w:history="1">
         <w:r>
           <w:rPr>
             <w:rStyle w:val="aff8"/>
@@ -353,7 +353,7 @@
             <w:noProof/>
             <w:webHidden/>
           </w:rPr>
-          <w:instrText xml:space="preserve"> PAGEREF _Toc241493190 \h </w:instrText>
+          <w:instrText xml:space="preserve"> PAGEREF _Toc241494089 \h </w:instrText>
         </w:r>
         <w:r>
           <w:rPr>
@@ -396,7 +396,7 @@
           <w:lang w:val="ru-RU" w:eastAsia="ru-RU"/>
         </w:rPr>
       </w:pPr>
-      <w:hyperlink w:anchor="_Toc241493191" w:history="1">
+      <w:hyperlink w:anchor="_Toc241494090" w:history="1">
         <w:r>
           <w:rPr>
             <w:rStyle w:val="aff8"/>
@@ -423,7 +423,7 @@
             <w:noProof/>
             <w:webHidden/>
           </w:rPr>
-          <w:instrText xml:space="preserve"> PAGEREF _Toc241493191 \h </w:instrText>
+          <w:instrText xml:space="preserve"> PAGEREF _Toc241494090 \h </w:instrText>
         </w:r>
         <w:r>
           <w:rPr>
@@ -466,7 +466,7 @@
           <w:lang w:val="ru-RU" w:eastAsia="ru-RU"/>
         </w:rPr>
       </w:pPr>
-      <w:hyperlink w:anchor="_Toc241493192" w:history="1">
+      <w:hyperlink w:anchor="_Toc241494091" w:history="1">
         <w:r>
           <w:rPr>
             <w:rStyle w:val="aff8"/>
@@ -493,7 +493,7 @@
             <w:noProof/>
             <w:webHidden/>
           </w:rPr>
-          <w:instrText xml:space="preserve"> PAGEREF _Toc241493192 \h </w:instrText>
+          <w:instrText xml:space="preserve"> PAGEREF _Toc241494091 \h </w:instrText>
         </w:r>
         <w:r>
           <w:rPr>
@@ -536,7 +536,7 @@
           <w:lang w:val="ru-RU" w:eastAsia="ru-RU"/>
         </w:rPr>
       </w:pPr>
-      <w:hyperlink w:anchor="_Toc241493193" w:history="1">
+      <w:hyperlink w:anchor="_Toc241494092" w:history="1">
         <w:r>
           <w:rPr>
             <w:rStyle w:val="aff8"/>
@@ -563,7 +563,7 @@
             <w:noProof/>
             <w:webHidden/>
           </w:rPr>
-          <w:instrText xml:space="preserve"> PAGEREF _Toc241493193 \h </w:instrText>
+          <w:instrText xml:space="preserve"> PAGEREF _Toc241494092 \h </w:instrText>
         </w:r>
         <w:r>
           <w:rPr>
@@ -606,7 +606,7 @@
           <w:lang w:val="ru-RU" w:eastAsia="ru-RU"/>
         </w:rPr>
       </w:pPr>
-      <w:hyperlink w:anchor="_Toc241493194" w:history="1">
+      <w:hyperlink w:anchor="_Toc241494093" w:history="1">
         <w:r>
           <w:rPr>
             <w:rStyle w:val="aff8"/>
@@ -633,7 +633,7 @@
             <w:noProof/>
             <w:webHidden/>
           </w:rPr>
-          <w:instrText xml:space="preserve"> PAGEREF _Toc241493194 \h </w:instrText>
+          <w:instrText xml:space="preserve"> PAGEREF _Toc241494093 \h </w:instrText>
         </w:r>
         <w:r>
           <w:rPr>
@@ -676,7 +676,7 @@
           <w:lang w:val="ru-RU" w:eastAsia="ru-RU"/>
         </w:rPr>
       </w:pPr>
-      <w:hyperlink w:anchor="_Toc241493195" w:history="1">
+      <w:hyperlink w:anchor="_Toc241494094" w:history="1">
         <w:r>
           <w:rPr>
             <w:rStyle w:val="aff8"/>
@@ -703,7 +703,7 @@
             <w:noProof/>
             <w:webHidden/>
           </w:rPr>
-          <w:instrText xml:space="preserve"> PAGEREF _Toc241493195 \h </w:instrText>
+          <w:instrText xml:space="preserve"> PAGEREF _Toc241494094 \h </w:instrText>
         </w:r>
         <w:r>
           <w:rPr>
@@ -746,7 +746,7 @@
           <w:lang w:val="ru-RU" w:eastAsia="ru-RU"/>
         </w:rPr>
       </w:pPr>
-      <w:hyperlink w:anchor="_Toc241493196" w:history="1">
+      <w:hyperlink w:anchor="_Toc241494095" w:history="1">
         <w:r>
           <w:rPr>
             <w:rStyle w:val="aff8"/>
@@ -773,7 +773,7 @@
             <w:noProof/>
             <w:webHidden/>
           </w:rPr>
-          <w:instrText xml:space="preserve"> PAGEREF _Toc241493196 \h </w:instrText>
+          <w:instrText xml:space="preserve"> PAGEREF _Toc241494095 \h </w:instrText>
         </w:r>
         <w:r>
           <w:rPr>
@@ -816,7 +816,7 @@
           <w:lang w:val="ru-RU" w:eastAsia="ru-RU"/>
         </w:rPr>
       </w:pPr>
-      <w:hyperlink w:anchor="_Toc241493197" w:history="1">
+      <w:hyperlink w:anchor="_Toc241494096" w:history="1">
         <w:r>
           <w:rPr>
             <w:rStyle w:val="aff8"/>
@@ -843,7 +843,7 @@
             <w:noProof/>
             <w:webHidden/>
           </w:rPr>
-          <w:instrText xml:space="preserve"> PAGEREF _Toc241493197 \h </w:instrText>
+          <w:instrText xml:space="preserve"> PAGEREF _Toc241494096 \h </w:instrText>
         </w:r>
         <w:r>
           <w:rPr>
@@ -886,7 +886,7 @@
           <w:lang w:val="ru-RU" w:eastAsia="ru-RU"/>
         </w:rPr>
       </w:pPr>
-      <w:hyperlink w:anchor="_Toc241493198" w:history="1">
+      <w:hyperlink w:anchor="_Toc241494097" w:history="1">
         <w:r>
           <w:rPr>
             <w:rStyle w:val="aff8"/>
@@ -913,7 +913,7 @@
             <w:noProof/>
             <w:webHidden/>
           </w:rPr>
-          <w:instrText xml:space="preserve"> PAGEREF _Toc241493198 \h </w:instrText>
+          <w:instrText xml:space="preserve"> PAGEREF _Toc241494097 \h </w:instrText>
         </w:r>
         <w:r>
           <w:rPr>
@@ -958,7 +958,7 @@
       <w:pPr>
         <w:pStyle w:val="1"/>
       </w:pPr>
-      <w:bookmarkStart w:id="0" w:name="_Toc241493187"/>
+      <w:bookmarkStart w:id="0" w:name="_Toc241494086"/>
       <w:r>
         <w:lastRenderedPageBreak/>
         <w:t>Развёртывание на серверах заказчика</w:t>
@@ -1340,7 +1340,7 @@
       <w:pPr>
         <w:pStyle w:val="21"/>
       </w:pPr>
-      <w:bookmarkStart w:id="1" w:name="_Toc241493188"/>
+      <w:bookmarkStart w:id="1" w:name="_Toc241494087"/>
       <w:r>
         <w:t>1. Что понадобится</w:t>
       </w:r>
@@ -2209,7 +2209,7 @@
       <w:pPr>
         <w:pStyle w:val="21"/>
       </w:pPr>
-      <w:bookmarkStart w:id="2" w:name="_Toc241493189"/>
+      <w:bookmarkStart w:id="2" w:name="_Toc241494088"/>
       <w:r>
         <w:t>2. Доставка на сервер</w:t>
       </w:r>
@@ -2487,7 +2487,7 @@
       <w:pPr>
         <w:pStyle w:val="21"/>
       </w:pPr>
-      <w:bookmarkStart w:id="3" w:name="_Toc241493190"/>
+      <w:bookmarkStart w:id="3" w:name="_Toc241494089"/>
       <w:r>
         <w:lastRenderedPageBreak/>
         <w:t xml:space="preserve">3. Состав каталога </w:t>
@@ -2851,7 +2851,7 @@
       <w:pPr>
         <w:pStyle w:val="21"/>
       </w:pPr>
-      <w:bookmarkStart w:id="4" w:name="_Toc241493191"/>
+      <w:bookmarkStart w:id="4" w:name="_Toc241494090"/>
       <w:r>
         <w:t>4. Настройка</w:t>
       </w:r>
@@ -5202,7 +5202,7 @@
       <w:pPr>
         <w:pStyle w:val="21"/>
       </w:pPr>
-      <w:bookmarkStart w:id="5" w:name="_Toc241493192"/>
+      <w:bookmarkStart w:id="5" w:name="_Toc241494091"/>
       <w:r>
         <w:t>5. Первый запуск</w:t>
       </w:r>
@@ -5606,7 +5606,7 @@
       <w:pPr>
         <w:pStyle w:val="21"/>
       </w:pPr>
-      <w:bookmarkStart w:id="6" w:name="_Toc241493193"/>
+      <w:bookmarkStart w:id="6" w:name="_Toc241494092"/>
       <w:r>
         <w:t>6. Подключение источников</w:t>
       </w:r>
@@ -6683,7 +6683,7 @@
       <w:pPr>
         <w:pStyle w:val="21"/>
       </w:pPr>
-      <w:bookmarkStart w:id="7" w:name="_Toc241493194"/>
+      <w:bookmarkStart w:id="7" w:name="_Toc241494093"/>
       <w:r>
         <w:t>7. Учебный контур</w:t>
       </w:r>
@@ -6831,7 +6831,7 @@
       <w:pPr>
         <w:pStyle w:val="21"/>
       </w:pPr>
-      <w:bookmarkStart w:id="8" w:name="_Toc241493195"/>
+      <w:bookmarkStart w:id="8" w:name="_Toc241494094"/>
       <w:r>
         <w:t xml:space="preserve">8. </w:t>
       </w:r>
@@ -7002,7 +7002,7 @@
       <w:pPr>
         <w:pStyle w:val="21"/>
       </w:pPr>
-      <w:bookmarkStart w:id="9" w:name="_Toc241493196"/>
+      <w:bookmarkStart w:id="9" w:name="_Toc241494095"/>
       <w:r>
         <w:t>9. Эксплуатация</w:t>
       </w:r>
@@ -7188,7 +7188,7 @@
       <w:pPr>
         <w:pStyle w:val="21"/>
       </w:pPr>
-      <w:bookmarkStart w:id="10" w:name="_Toc241493197"/>
+      <w:bookmarkStart w:id="10" w:name="_Toc241494096"/>
       <w:r>
         <w:t>10. Типичные проблемы</w:t>
       </w:r>
@@ -7730,7 +7730,7 @@
       <w:pPr>
         <w:pStyle w:val="21"/>
       </w:pPr>
-      <w:bookmarkStart w:id="11" w:name="_Toc241493198"/>
+      <w:bookmarkStart w:id="11" w:name="_Toc241494097"/>
       <w:r>
         <w:lastRenderedPageBreak/>
         <w:t>11. Перед вводом в эксплуатацию</w:t>
@@ -19597,7 +19597,7 @@
     <w:autoRedefine/>
     <w:uiPriority w:val="39"/>
     <w:unhideWhenUsed/>
-    <w:rsid w:val="005D4262"/>
+    <w:rsid w:val="002338C0"/>
     <w:pPr>
       <w:spacing w:after="100"/>
     </w:pPr>
@@ -19609,7 +19609,7 @@
     <w:autoRedefine/>
     <w:uiPriority w:val="39"/>
     <w:unhideWhenUsed/>
-    <w:rsid w:val="005D4262"/>
+    <w:rsid w:val="002338C0"/>
     <w:pPr>
       <w:spacing w:after="100"/>
       <w:ind w:left="220"/>
@@ -19620,7 +19620,7 @@
     <w:basedOn w:val="a2"/>
     <w:uiPriority w:val="99"/>
     <w:unhideWhenUsed/>
-    <w:rsid w:val="005D4262"/>
+    <w:rsid w:val="002338C0"/>
     <w:rPr>
       <w:color w:val="0000FF" w:themeColor="hyperlink"/>
       <w:u w:val="single"/>

</xml_diff>

<commit_message>
docs: general user guide, reviewer handout, modes and full ticket cycle in role guides
- General guide for all roles: login and who creates users, roles and zones, working modes, incident
  card and work order from start to closing, menu by role
- Reviewer handout: stand addresses, test accounts, 20–30 minute check route
- Role guides: ticket cycle to closing and working modes per role
- Chapters: floors and plan opacity, vertex removal, help desk off mode, shipped models,
  simulator presets, Prometheus alerts; documentation 120 pages, presentation rebuilt

Co-Authored-By: Claude Opus 5.5 (1M context) <noreply@anthropic.com>
</commit_message>
<xml_diff>
--- a/docs/delivery/out/Инструкция по развёртыванию.docx
+++ b/docs/delivery/out/Инструкция по развёртыванию.docx
@@ -116,7 +116,7 @@
       <w:r>
         <w:fldChar w:fldCharType="separate"/>
       </w:r>
-      <w:hyperlink w:anchor="_Toc241494086" w:history="1">
+      <w:hyperlink w:anchor="_Toc241594683" w:history="1">
         <w:r>
           <w:rPr>
             <w:rStyle w:val="aff8"/>
@@ -143,7 +143,7 @@
             <w:noProof/>
             <w:webHidden/>
           </w:rPr>
-          <w:instrText xml:space="preserve"> PAGEREF _Toc241494086 \h </w:instrText>
+          <w:instrText xml:space="preserve"> PAGEREF _Toc241594683 \h </w:instrText>
         </w:r>
         <w:r>
           <w:rPr>
@@ -186,7 +186,7 @@
           <w:lang w:val="ru-RU" w:eastAsia="ru-RU"/>
         </w:rPr>
       </w:pPr>
-      <w:hyperlink w:anchor="_Toc241494087" w:history="1">
+      <w:hyperlink w:anchor="_Toc241594684" w:history="1">
         <w:r>
           <w:rPr>
             <w:rStyle w:val="aff8"/>
@@ -213,7 +213,7 @@
             <w:noProof/>
             <w:webHidden/>
           </w:rPr>
-          <w:instrText xml:space="preserve"> PAGEREF _Toc241494087 \h </w:instrText>
+          <w:instrText xml:space="preserve"> PAGEREF _Toc241594684 \h </w:instrText>
         </w:r>
         <w:r>
           <w:rPr>
@@ -256,7 +256,7 @@
           <w:lang w:val="ru-RU" w:eastAsia="ru-RU"/>
         </w:rPr>
       </w:pPr>
-      <w:hyperlink w:anchor="_Toc241494088" w:history="1">
+      <w:hyperlink w:anchor="_Toc241594685" w:history="1">
         <w:r>
           <w:rPr>
             <w:rStyle w:val="aff8"/>
@@ -283,7 +283,7 @@
             <w:noProof/>
             <w:webHidden/>
           </w:rPr>
-          <w:instrText xml:space="preserve"> PAGEREF _Toc241494088 \h </w:instrText>
+          <w:instrText xml:space="preserve"> PAGEREF _Toc241594685 \h </w:instrText>
         </w:r>
         <w:r>
           <w:rPr>
@@ -326,7 +326,7 @@
           <w:lang w:val="ru-RU" w:eastAsia="ru-RU"/>
         </w:rPr>
       </w:pPr>
-      <w:hyperlink w:anchor="_Toc241494089" w:history="1">
+      <w:hyperlink w:anchor="_Toc241594686" w:history="1">
         <w:r>
           <w:rPr>
             <w:rStyle w:val="aff8"/>
@@ -353,7 +353,7 @@
             <w:noProof/>
             <w:webHidden/>
           </w:rPr>
-          <w:instrText xml:space="preserve"> PAGEREF _Toc241494089 \h </w:instrText>
+          <w:instrText xml:space="preserve"> PAGEREF _Toc241594686 \h </w:instrText>
         </w:r>
         <w:r>
           <w:rPr>
@@ -396,7 +396,7 @@
           <w:lang w:val="ru-RU" w:eastAsia="ru-RU"/>
         </w:rPr>
       </w:pPr>
-      <w:hyperlink w:anchor="_Toc241494090" w:history="1">
+      <w:hyperlink w:anchor="_Toc241594687" w:history="1">
         <w:r>
           <w:rPr>
             <w:rStyle w:val="aff8"/>
@@ -423,7 +423,7 @@
             <w:noProof/>
             <w:webHidden/>
           </w:rPr>
-          <w:instrText xml:space="preserve"> PAGEREF _Toc241494090 \h </w:instrText>
+          <w:instrText xml:space="preserve"> PAGEREF _Toc241594687 \h </w:instrText>
         </w:r>
         <w:r>
           <w:rPr>
@@ -466,7 +466,7 @@
           <w:lang w:val="ru-RU" w:eastAsia="ru-RU"/>
         </w:rPr>
       </w:pPr>
-      <w:hyperlink w:anchor="_Toc241494091" w:history="1">
+      <w:hyperlink w:anchor="_Toc241594688" w:history="1">
         <w:r>
           <w:rPr>
             <w:rStyle w:val="aff8"/>
@@ -493,7 +493,7 @@
             <w:noProof/>
             <w:webHidden/>
           </w:rPr>
-          <w:instrText xml:space="preserve"> PAGEREF _Toc241494091 \h </w:instrText>
+          <w:instrText xml:space="preserve"> PAGEREF _Toc241594688 \h </w:instrText>
         </w:r>
         <w:r>
           <w:rPr>
@@ -536,7 +536,7 @@
           <w:lang w:val="ru-RU" w:eastAsia="ru-RU"/>
         </w:rPr>
       </w:pPr>
-      <w:hyperlink w:anchor="_Toc241494092" w:history="1">
+      <w:hyperlink w:anchor="_Toc241594689" w:history="1">
         <w:r>
           <w:rPr>
             <w:rStyle w:val="aff8"/>
@@ -563,7 +563,7 @@
             <w:noProof/>
             <w:webHidden/>
           </w:rPr>
-          <w:instrText xml:space="preserve"> PAGEREF _Toc241494092 \h </w:instrText>
+          <w:instrText xml:space="preserve"> PAGEREF _Toc241594689 \h </w:instrText>
         </w:r>
         <w:r>
           <w:rPr>
@@ -606,7 +606,7 @@
           <w:lang w:val="ru-RU" w:eastAsia="ru-RU"/>
         </w:rPr>
       </w:pPr>
-      <w:hyperlink w:anchor="_Toc241494093" w:history="1">
+      <w:hyperlink w:anchor="_Toc241594690" w:history="1">
         <w:r>
           <w:rPr>
             <w:rStyle w:val="aff8"/>
@@ -633,147 +633,7 @@
             <w:noProof/>
             <w:webHidden/>
           </w:rPr>
-          <w:instrText xml:space="preserve"> PAGEREF _Toc241494093 \h </w:instrText>
-        </w:r>
-        <w:r>
-          <w:rPr>
-            <w:noProof/>
-            <w:webHidden/>
-          </w:rPr>
-        </w:r>
-        <w:r>
-          <w:rPr>
-            <w:noProof/>
-            <w:webHidden/>
-          </w:rPr>
-          <w:fldChar w:fldCharType="separate"/>
-        </w:r>
-        <w:r>
-          <w:rPr>
-            <w:noProof/>
-            <w:webHidden/>
-          </w:rPr>
-          <w:t>10</w:t>
-        </w:r>
-        <w:r>
-          <w:rPr>
-            <w:noProof/>
-            <w:webHidden/>
-          </w:rPr>
-          <w:fldChar w:fldCharType="end"/>
-        </w:r>
-      </w:hyperlink>
-    </w:p>
-    <w:p>
-      <w:pPr>
-        <w:pStyle w:val="2c"/>
-        <w:tabs>
-          <w:tab w:val="right" w:leader="dot" w:pos="9628"/>
-        </w:tabs>
-        <w:rPr>
-          <w:rFonts w:asciiTheme="minorHAnsi" w:eastAsiaTheme="minorEastAsia" w:hAnsiTheme="minorHAnsi"/>
-          <w:noProof/>
-          <w:lang w:val="ru-RU" w:eastAsia="ru-RU"/>
-        </w:rPr>
-      </w:pPr>
-      <w:hyperlink w:anchor="_Toc241494094" w:history="1">
-        <w:r>
-          <w:rPr>
-            <w:rStyle w:val="aff8"/>
-            <w:noProof/>
-          </w:rPr>
-          <w:t>8. Обновление</w:t>
-        </w:r>
-        <w:r>
-          <w:rPr>
-            <w:noProof/>
-            <w:webHidden/>
-          </w:rPr>
-          <w:tab/>
-        </w:r>
-        <w:r>
-          <w:rPr>
-            <w:noProof/>
-            <w:webHidden/>
-          </w:rPr>
-          <w:fldChar w:fldCharType="begin"/>
-        </w:r>
-        <w:r>
-          <w:rPr>
-            <w:noProof/>
-            <w:webHidden/>
-          </w:rPr>
-          <w:instrText xml:space="preserve"> PAGEREF _Toc241494094 \h </w:instrText>
-        </w:r>
-        <w:r>
-          <w:rPr>
-            <w:noProof/>
-            <w:webHidden/>
-          </w:rPr>
-        </w:r>
-        <w:r>
-          <w:rPr>
-            <w:noProof/>
-            <w:webHidden/>
-          </w:rPr>
-          <w:fldChar w:fldCharType="separate"/>
-        </w:r>
-        <w:r>
-          <w:rPr>
-            <w:noProof/>
-            <w:webHidden/>
-          </w:rPr>
-          <w:t>10</w:t>
-        </w:r>
-        <w:r>
-          <w:rPr>
-            <w:noProof/>
-            <w:webHidden/>
-          </w:rPr>
-          <w:fldChar w:fldCharType="end"/>
-        </w:r>
-      </w:hyperlink>
-    </w:p>
-    <w:p>
-      <w:pPr>
-        <w:pStyle w:val="2c"/>
-        <w:tabs>
-          <w:tab w:val="right" w:leader="dot" w:pos="9628"/>
-        </w:tabs>
-        <w:rPr>
-          <w:rFonts w:asciiTheme="minorHAnsi" w:eastAsiaTheme="minorEastAsia" w:hAnsiTheme="minorHAnsi"/>
-          <w:noProof/>
-          <w:lang w:val="ru-RU" w:eastAsia="ru-RU"/>
-        </w:rPr>
-      </w:pPr>
-      <w:hyperlink w:anchor="_Toc241494095" w:history="1">
-        <w:r>
-          <w:rPr>
-            <w:rStyle w:val="aff8"/>
-            <w:noProof/>
-          </w:rPr>
-          <w:t>9. Эксплуатация</w:t>
-        </w:r>
-        <w:r>
-          <w:rPr>
-            <w:noProof/>
-            <w:webHidden/>
-          </w:rPr>
-          <w:tab/>
-        </w:r>
-        <w:r>
-          <w:rPr>
-            <w:noProof/>
-            <w:webHidden/>
-          </w:rPr>
-          <w:fldChar w:fldCharType="begin"/>
-        </w:r>
-        <w:r>
-          <w:rPr>
-            <w:noProof/>
-            <w:webHidden/>
-          </w:rPr>
-          <w:instrText xml:space="preserve"> PAGEREF _Toc241494095 \h </w:instrText>
+          <w:instrText xml:space="preserve"> PAGEREF _Toc241594690 \h </w:instrText>
         </w:r>
         <w:r>
           <w:rPr>
@@ -816,13 +676,13 @@
           <w:lang w:val="ru-RU" w:eastAsia="ru-RU"/>
         </w:rPr>
       </w:pPr>
-      <w:hyperlink w:anchor="_Toc241494096" w:history="1">
+      <w:hyperlink w:anchor="_Toc241594691" w:history="1">
         <w:r>
           <w:rPr>
             <w:rStyle w:val="aff8"/>
             <w:noProof/>
           </w:rPr>
-          <w:t>10. Типичные проблемы</w:t>
+          <w:t>8. Обновление</w:t>
         </w:r>
         <w:r>
           <w:rPr>
@@ -843,7 +703,7 @@
             <w:noProof/>
             <w:webHidden/>
           </w:rPr>
-          <w:instrText xml:space="preserve"> PAGEREF _Toc241494096 \h </w:instrText>
+          <w:instrText xml:space="preserve"> PAGEREF _Toc241594691 \h </w:instrText>
         </w:r>
         <w:r>
           <w:rPr>
@@ -886,13 +746,13 @@
           <w:lang w:val="ru-RU" w:eastAsia="ru-RU"/>
         </w:rPr>
       </w:pPr>
-      <w:hyperlink w:anchor="_Toc241494097" w:history="1">
+      <w:hyperlink w:anchor="_Toc241594692" w:history="1">
         <w:r>
           <w:rPr>
             <w:rStyle w:val="aff8"/>
             <w:noProof/>
           </w:rPr>
-          <w:t>11. Перед вводом в эксплуатацию</w:t>
+          <w:t>9. Эксплуатация</w:t>
         </w:r>
         <w:r>
           <w:rPr>
@@ -913,7 +773,77 @@
             <w:noProof/>
             <w:webHidden/>
           </w:rPr>
-          <w:instrText xml:space="preserve"> PAGEREF _Toc241494097 \h </w:instrText>
+          <w:instrText xml:space="preserve"> PAGEREF _Toc241594692 \h </w:instrText>
+        </w:r>
+        <w:r>
+          <w:rPr>
+            <w:noProof/>
+            <w:webHidden/>
+          </w:rPr>
+        </w:r>
+        <w:r>
+          <w:rPr>
+            <w:noProof/>
+            <w:webHidden/>
+          </w:rPr>
+          <w:fldChar w:fldCharType="separate"/>
+        </w:r>
+        <w:r>
+          <w:rPr>
+            <w:noProof/>
+            <w:webHidden/>
+          </w:rPr>
+          <w:t>11</w:t>
+        </w:r>
+        <w:r>
+          <w:rPr>
+            <w:noProof/>
+            <w:webHidden/>
+          </w:rPr>
+          <w:fldChar w:fldCharType="end"/>
+        </w:r>
+      </w:hyperlink>
+    </w:p>
+    <w:p>
+      <w:pPr>
+        <w:pStyle w:val="2c"/>
+        <w:tabs>
+          <w:tab w:val="right" w:leader="dot" w:pos="9628"/>
+        </w:tabs>
+        <w:rPr>
+          <w:rFonts w:asciiTheme="minorHAnsi" w:eastAsiaTheme="minorEastAsia" w:hAnsiTheme="minorHAnsi"/>
+          <w:noProof/>
+          <w:lang w:val="ru-RU" w:eastAsia="ru-RU"/>
+        </w:rPr>
+      </w:pPr>
+      <w:hyperlink w:anchor="_Toc241594693" w:history="1">
+        <w:r>
+          <w:rPr>
+            <w:rStyle w:val="aff8"/>
+            <w:noProof/>
+          </w:rPr>
+          <w:t>10. Типичные проблемы</w:t>
+        </w:r>
+        <w:r>
+          <w:rPr>
+            <w:noProof/>
+            <w:webHidden/>
+          </w:rPr>
+          <w:tab/>
+        </w:r>
+        <w:r>
+          <w:rPr>
+            <w:noProof/>
+            <w:webHidden/>
+          </w:rPr>
+          <w:fldChar w:fldCharType="begin"/>
+        </w:r>
+        <w:r>
+          <w:rPr>
+            <w:noProof/>
+            <w:webHidden/>
+          </w:rPr>
+          <w:instrText xml:space="preserve"> PAGEREF _Toc241594693 \h </w:instrText>
         </w:r>
         <w:r>
           <w:rPr>
@@ -945,6 +875,76 @@
       </w:hyperlink>
     </w:p>
     <w:p>
+      <w:pPr>
+        <w:pStyle w:val="2c"/>
+        <w:tabs>
+          <w:tab w:val="right" w:leader="dot" w:pos="9628"/>
+        </w:tabs>
+        <w:rPr>
+          <w:rFonts w:asciiTheme="minorHAnsi" w:eastAsiaTheme="minorEastAsia" w:hAnsiTheme="minorHAnsi"/>
+          <w:noProof/>
+          <w:lang w:val="ru-RU" w:eastAsia="ru-RU"/>
+        </w:rPr>
+      </w:pPr>
+      <w:hyperlink w:anchor="_Toc241594694" w:history="1">
+        <w:r>
+          <w:rPr>
+            <w:rStyle w:val="aff8"/>
+            <w:noProof/>
+          </w:rPr>
+          <w:t>11. Перед вводом в эксплуатацию</w:t>
+        </w:r>
+        <w:r>
+          <w:rPr>
+            <w:noProof/>
+            <w:webHidden/>
+          </w:rPr>
+          <w:tab/>
+        </w:r>
+        <w:r>
+          <w:rPr>
+            <w:noProof/>
+            <w:webHidden/>
+          </w:rPr>
+          <w:fldChar w:fldCharType="begin"/>
+        </w:r>
+        <w:r>
+          <w:rPr>
+            <w:noProof/>
+            <w:webHidden/>
+          </w:rPr>
+          <w:instrText xml:space="preserve"> PAGEREF _Toc241594694 \h </w:instrText>
+        </w:r>
+        <w:r>
+          <w:rPr>
+            <w:noProof/>
+            <w:webHidden/>
+          </w:rPr>
+        </w:r>
+        <w:r>
+          <w:rPr>
+            <w:noProof/>
+            <w:webHidden/>
+          </w:rPr>
+          <w:fldChar w:fldCharType="separate"/>
+        </w:r>
+        <w:r>
+          <w:rPr>
+            <w:noProof/>
+            <w:webHidden/>
+          </w:rPr>
+          <w:t>12</w:t>
+        </w:r>
+        <w:r>
+          <w:rPr>
+            <w:noProof/>
+            <w:webHidden/>
+          </w:rPr>
+          <w:fldChar w:fldCharType="end"/>
+        </w:r>
+      </w:hyperlink>
+    </w:p>
+    <w:p>
       <w:r>
         <w:fldChar w:fldCharType="end"/>
       </w:r>
@@ -958,7 +958,7 @@
       <w:pPr>
         <w:pStyle w:val="1"/>
       </w:pPr>
-      <w:bookmarkStart w:id="0" w:name="_Toc241494086"/>
+      <w:bookmarkStart w:id="0" w:name="_Toc241594683"/>
       <w:r>
         <w:lastRenderedPageBreak/>
         <w:t>Развёртывание на серверах заказчика</w:t>
@@ -1340,7 +1340,7 @@
       <w:pPr>
         <w:pStyle w:val="21"/>
       </w:pPr>
-      <w:bookmarkStart w:id="1" w:name="_Toc241494087"/>
+      <w:bookmarkStart w:id="1" w:name="_Toc241594684"/>
       <w:r>
         <w:t>1. Что понадобится</w:t>
       </w:r>
@@ -2209,7 +2209,7 @@
       <w:pPr>
         <w:pStyle w:val="21"/>
       </w:pPr>
-      <w:bookmarkStart w:id="2" w:name="_Toc241494088"/>
+      <w:bookmarkStart w:id="2" w:name="_Toc241594685"/>
       <w:r>
         <w:t>2. Доставка на сервер</w:t>
       </w:r>
@@ -2487,7 +2487,7 @@
       <w:pPr>
         <w:pStyle w:val="21"/>
       </w:pPr>
-      <w:bookmarkStart w:id="3" w:name="_Toc241494089"/>
+      <w:bookmarkStart w:id="3" w:name="_Toc241594686"/>
       <w:r>
         <w:lastRenderedPageBreak/>
         <w:t xml:space="preserve">3. Состав каталога </w:t>
@@ -2851,7 +2851,7 @@
       <w:pPr>
         <w:pStyle w:val="21"/>
       </w:pPr>
-      <w:bookmarkStart w:id="4" w:name="_Toc241494090"/>
+      <w:bookmarkStart w:id="4" w:name="_Toc241594687"/>
       <w:r>
         <w:t>4. Настройка</w:t>
       </w:r>
@@ -4824,7 +4824,20 @@
                 <w:rFonts w:ascii="Consolas" w:hAnsi="Consolas"/>
                 <w:sz w:val="16"/>
               </w:rPr>
-              <w:t>WEATHER_URL</w:t>
+              <w:t>MAP_SATELLITE_TILES</w:t>
+            </w:r>
+            <w:r>
+              <w:rPr>
+                <w:sz w:val="18"/>
+              </w:rPr>
+              <w:t xml:space="preserve">, </w:t>
+            </w:r>
+            <w:r>
+              <w:rPr>
+                <w:rFonts w:ascii="Consolas" w:hAnsi="Consolas"/>
+                <w:sz w:val="16"/>
+              </w:rPr>
+              <w:t>MAP_SATELLITE_ORIGIN</w:t>
             </w:r>
           </w:p>
         </w:tc>
@@ -4837,7 +4850,7 @@
               <w:rPr>
                 <w:sz w:val="18"/>
               </w:rPr>
-              <w:t>Open-Meteo; без интернета задача погоды выключается (раздел 6.4)</w:t>
+              <w:t>спутниковые растровые тайлы (по умолчанию Esri World Imagery) и их адрес для CSP; пусто — без спутника</w:t>
             </w:r>
           </w:p>
         </w:tc>
@@ -4856,91 +4869,27 @@
                 <w:rFonts w:ascii="Consolas" w:hAnsi="Consolas"/>
                 <w:sz w:val="16"/>
               </w:rPr>
-              <w:t>HELPDESK_MODE</w:t>
-            </w:r>
-            <w:r>
-              <w:rPr>
-                <w:sz w:val="18"/>
-              </w:rPr>
-              <w:t xml:space="preserve">, </w:t>
+              <w:t>SEGMENTER_URL</w:t>
+            </w:r>
+          </w:p>
+        </w:tc>
+        <w:tc>
+          <w:tcPr>
+            <w:tcW w:w="4819" w:type="dxa"/>
+          </w:tcPr>
+          <w:p>
+            <w:r>
+              <w:rPr>
+                <w:sz w:val="18"/>
+              </w:rPr>
+              <w:t xml:space="preserve">сервис ИИ-выделения зданий по снимку (раздел 6.3); по умолчанию </w:t>
             </w:r>
             <w:r>
               <w:rPr>
                 <w:rFonts w:ascii="Consolas" w:hAnsi="Consolas"/>
                 <w:sz w:val="16"/>
               </w:rPr>
-              <w:t>HELPDESK_URL</w:t>
-            </w:r>
-            <w:r>
-              <w:rPr>
-                <w:sz w:val="18"/>
-              </w:rPr>
-              <w:t xml:space="preserve">, </w:t>
-            </w:r>
-            <w:r>
-              <w:rPr>
-                <w:rFonts w:ascii="Consolas" w:hAnsi="Consolas"/>
-                <w:sz w:val="16"/>
-              </w:rPr>
-              <w:t>HELPDESK_TOKEN</w:t>
-            </w:r>
-            <w:r>
-              <w:rPr>
-                <w:sz w:val="18"/>
-              </w:rPr>
-              <w:t>…</w:t>
-            </w:r>
-          </w:p>
-        </w:tc>
-        <w:tc>
-          <w:tcPr>
-            <w:tcW w:w="4819" w:type="dxa"/>
-          </w:tcPr>
-          <w:p>
-            <w:r>
-              <w:rPr>
-                <w:sz w:val="18"/>
-              </w:rPr>
-              <w:t xml:space="preserve">система учёта заявок: </w:t>
-            </w:r>
-            <w:r>
-              <w:rPr>
-                <w:rFonts w:ascii="Consolas" w:hAnsi="Consolas"/>
-                <w:sz w:val="16"/>
-              </w:rPr>
-              <w:t>mock</w:t>
-            </w:r>
-            <w:r>
-              <w:rPr>
-                <w:sz w:val="18"/>
-              </w:rPr>
-              <w:t xml:space="preserve">, </w:t>
-            </w:r>
-            <w:r>
-              <w:rPr>
-                <w:rFonts w:ascii="Consolas" w:hAnsi="Consolas"/>
-                <w:sz w:val="16"/>
-              </w:rPr>
-              <w:t>rest</w:t>
-            </w:r>
-            <w:r>
-              <w:rPr>
-                <w:sz w:val="18"/>
-              </w:rPr>
-              <w:t xml:space="preserve"> или </w:t>
-            </w:r>
-            <w:r>
-              <w:rPr>
-                <w:rFonts w:ascii="Consolas" w:hAnsi="Consolas"/>
-                <w:sz w:val="16"/>
-              </w:rPr>
-              <w:t>off</w:t>
-            </w:r>
-            <w:r>
-              <w:rPr>
-                <w:sz w:val="18"/>
-              </w:rPr>
-              <w:t xml:space="preserve"> (раздел 6.5)</w:t>
+              <w:t>http://segmenter:8000</w:t>
             </w:r>
           </w:p>
         </w:tc>
@@ -4959,33 +4908,7 @@
                 <w:rFonts w:ascii="Consolas" w:hAnsi="Consolas"/>
                 <w:sz w:val="16"/>
               </w:rPr>
-              <w:t>REGISTRY_MODE</w:t>
-            </w:r>
-            <w:r>
-              <w:rPr>
-                <w:sz w:val="18"/>
-              </w:rPr>
-              <w:t xml:space="preserve">, </w:t>
-            </w:r>
-            <w:r>
-              <w:rPr>
-                <w:rFonts w:ascii="Consolas" w:hAnsi="Consolas"/>
-                <w:sz w:val="16"/>
-              </w:rPr>
-              <w:t>REGISTRY_URL</w:t>
-            </w:r>
-            <w:r>
-              <w:rPr>
-                <w:sz w:val="18"/>
-              </w:rPr>
-              <w:t xml:space="preserve">, </w:t>
-            </w:r>
-            <w:r>
-              <w:rPr>
-                <w:rFonts w:ascii="Consolas" w:hAnsi="Consolas"/>
-                <w:sz w:val="16"/>
-              </w:rPr>
-              <w:t>REGISTRY_TOKEN</w:t>
+              <w:t>WEATHER_URL</w:t>
             </w:r>
           </w:p>
         </w:tc>
@@ -4998,46 +4921,7 @@
               <w:rPr>
                 <w:sz w:val="18"/>
               </w:rPr>
-              <w:t xml:space="preserve">реестр оборудования: </w:t>
-            </w:r>
-            <w:r>
-              <w:rPr>
-                <w:rFonts w:ascii="Consolas" w:hAnsi="Consolas"/>
-                <w:sz w:val="16"/>
-              </w:rPr>
-              <w:t>emulated</w:t>
-            </w:r>
-            <w:r>
-              <w:rPr>
-                <w:sz w:val="18"/>
-              </w:rPr>
-              <w:t xml:space="preserve">, </w:t>
-            </w:r>
-            <w:r>
-              <w:rPr>
-                <w:rFonts w:ascii="Consolas" w:hAnsi="Consolas"/>
-                <w:sz w:val="16"/>
-              </w:rPr>
-              <w:t>api</w:t>
-            </w:r>
-            <w:r>
-              <w:rPr>
-                <w:sz w:val="18"/>
-              </w:rPr>
-              <w:t xml:space="preserve"> или </w:t>
-            </w:r>
-            <w:r>
-              <w:rPr>
-                <w:rFonts w:ascii="Consolas" w:hAnsi="Consolas"/>
-                <w:sz w:val="16"/>
-              </w:rPr>
-              <w:t>file</w:t>
-            </w:r>
-            <w:r>
-              <w:rPr>
-                <w:sz w:val="18"/>
-              </w:rPr>
-              <w:t xml:space="preserve"> (раздел 6.6)</w:t>
+              <w:t>Open-Meteo; без интернета задача погоды выключается (раздел 6.4)</w:t>
             </w:r>
           </w:p>
         </w:tc>
@@ -5056,7 +4940,7 @@
                 <w:rFonts w:ascii="Consolas" w:hAnsi="Consolas"/>
                 <w:sz w:val="16"/>
               </w:rPr>
-              <w:t>VMS_MODE</w:t>
+              <w:t>HELPDESK_MODE</w:t>
             </w:r>
             <w:r>
               <w:rPr>
@@ -5069,7 +4953,7 @@
                 <w:rFonts w:ascii="Consolas" w:hAnsi="Consolas"/>
                 <w:sz w:val="16"/>
               </w:rPr>
-              <w:t>VMS_URL</w:t>
+              <w:t>HELPDESK_URL</w:t>
             </w:r>
             <w:r>
               <w:rPr>
@@ -5082,78 +4966,71 @@
                 <w:rFonts w:ascii="Consolas" w:hAnsi="Consolas"/>
                 <w:sz w:val="16"/>
               </w:rPr>
-              <w:t>VMS_TOKEN</w:t>
-            </w:r>
-            <w:r>
-              <w:rPr>
-                <w:sz w:val="18"/>
-              </w:rPr>
-              <w:t xml:space="preserve">, </w:t>
+              <w:t>HELPDESK_TOKEN</w:t>
+            </w:r>
+            <w:r>
+              <w:rPr>
+                <w:sz w:val="18"/>
+              </w:rPr>
+              <w:t>…</w:t>
+            </w:r>
+          </w:p>
+        </w:tc>
+        <w:tc>
+          <w:tcPr>
+            <w:tcW w:w="4819" w:type="dxa"/>
+          </w:tcPr>
+          <w:p>
+            <w:r>
+              <w:rPr>
+                <w:sz w:val="18"/>
+              </w:rPr>
+              <w:t xml:space="preserve">система учёта заявок: </w:t>
             </w:r>
             <w:r>
               <w:rPr>
                 <w:rFonts w:ascii="Consolas" w:hAnsi="Consolas"/>
                 <w:sz w:val="16"/>
               </w:rPr>
-              <w:t>VMS_LIVE_URL</w:t>
-            </w:r>
-            <w:r>
-              <w:rPr>
-                <w:sz w:val="18"/>
-              </w:rPr>
-              <w:t>…</w:t>
-            </w:r>
-          </w:p>
-        </w:tc>
-        <w:tc>
-          <w:tcPr>
-            <w:tcW w:w="4819" w:type="dxa"/>
-          </w:tcPr>
-          <w:p>
-            <w:r>
-              <w:rPr>
-                <w:sz w:val="18"/>
-              </w:rPr>
-              <w:t xml:space="preserve">видеонаблюдение: </w:t>
+              <w:t>mock</w:t>
+            </w:r>
+            <w:r>
+              <w:rPr>
+                <w:sz w:val="18"/>
+              </w:rPr>
+              <w:t xml:space="preserve">, </w:t>
             </w:r>
             <w:r>
               <w:rPr>
                 <w:rFonts w:ascii="Consolas" w:hAnsi="Consolas"/>
                 <w:sz w:val="16"/>
               </w:rPr>
-              <w:t>mock</w:t>
-            </w:r>
-            <w:r>
-              <w:rPr>
-                <w:sz w:val="18"/>
-              </w:rPr>
-              <w:t xml:space="preserve">, </w:t>
+              <w:t>rest</w:t>
+            </w:r>
+            <w:r>
+              <w:rPr>
+                <w:sz w:val="18"/>
+              </w:rPr>
+              <w:t xml:space="preserve"> или </w:t>
             </w:r>
             <w:r>
               <w:rPr>
                 <w:rFonts w:ascii="Consolas" w:hAnsi="Consolas"/>
                 <w:sz w:val="16"/>
               </w:rPr>
-              <w:t>http</w:t>
-            </w:r>
-            <w:r>
-              <w:rPr>
-                <w:sz w:val="18"/>
-              </w:rPr>
-              <w:t xml:space="preserve"> или </w:t>
-            </w:r>
-            <w:r>
-              <w:rPr>
-                <w:rFonts w:ascii="Consolas" w:hAnsi="Consolas"/>
-                <w:sz w:val="16"/>
-              </w:rPr>
               <w:t>off</w:t>
             </w:r>
             <w:r>
               <w:rPr>
                 <w:sz w:val="18"/>
               </w:rPr>
-              <w:t xml:space="preserve"> (раздел 6.7)</w:t>
+              <w:t xml:space="preserve"> (разд</w:t>
+            </w:r>
+            <w:r>
+              <w:rPr>
+                <w:sz w:val="18"/>
+              </w:rPr>
+              <w:t>ел 6.5)</w:t>
             </w:r>
           </w:p>
         </w:tc>
@@ -5172,6 +5049,219 @@
                 <w:rFonts w:ascii="Consolas" w:hAnsi="Consolas"/>
                 <w:sz w:val="16"/>
               </w:rPr>
+              <w:t>REGISTRY_MODE</w:t>
+            </w:r>
+            <w:r>
+              <w:rPr>
+                <w:sz w:val="18"/>
+              </w:rPr>
+              <w:t xml:space="preserve">, </w:t>
+            </w:r>
+            <w:r>
+              <w:rPr>
+                <w:rFonts w:ascii="Consolas" w:hAnsi="Consolas"/>
+                <w:sz w:val="16"/>
+              </w:rPr>
+              <w:t>REGISTRY_URL</w:t>
+            </w:r>
+            <w:r>
+              <w:rPr>
+                <w:sz w:val="18"/>
+              </w:rPr>
+              <w:t xml:space="preserve">, </w:t>
+            </w:r>
+            <w:r>
+              <w:rPr>
+                <w:rFonts w:ascii="Consolas" w:hAnsi="Consolas"/>
+                <w:sz w:val="16"/>
+              </w:rPr>
+              <w:t>REGISTRY_TOKEN</w:t>
+            </w:r>
+          </w:p>
+        </w:tc>
+        <w:tc>
+          <w:tcPr>
+            <w:tcW w:w="4819" w:type="dxa"/>
+          </w:tcPr>
+          <w:p>
+            <w:r>
+              <w:rPr>
+                <w:sz w:val="18"/>
+              </w:rPr>
+              <w:t xml:space="preserve">реестр оборудования: </w:t>
+            </w:r>
+            <w:r>
+              <w:rPr>
+                <w:rFonts w:ascii="Consolas" w:hAnsi="Consolas"/>
+                <w:sz w:val="16"/>
+              </w:rPr>
+              <w:t>emulated</w:t>
+            </w:r>
+            <w:r>
+              <w:rPr>
+                <w:sz w:val="18"/>
+              </w:rPr>
+              <w:t xml:space="preserve">, </w:t>
+            </w:r>
+            <w:r>
+              <w:rPr>
+                <w:rFonts w:ascii="Consolas" w:hAnsi="Consolas"/>
+                <w:sz w:val="16"/>
+              </w:rPr>
+              <w:t>api</w:t>
+            </w:r>
+            <w:r>
+              <w:rPr>
+                <w:sz w:val="18"/>
+              </w:rPr>
+              <w:t xml:space="preserve"> или </w:t>
+            </w:r>
+            <w:r>
+              <w:rPr>
+                <w:rFonts w:ascii="Consolas" w:hAnsi="Consolas"/>
+                <w:sz w:val="16"/>
+              </w:rPr>
+              <w:t>file</w:t>
+            </w:r>
+            <w:r>
+              <w:rPr>
+                <w:sz w:val="18"/>
+              </w:rPr>
+              <w:t xml:space="preserve"> (раздел 6.6)</w:t>
+            </w:r>
+          </w:p>
+        </w:tc>
+      </w:tr>
+      <w:tr>
+        <w:trPr>
+          <w:jc w:val="center"/>
+        </w:trPr>
+        <w:tc>
+          <w:tcPr>
+            <w:tcW w:w="4819" w:type="dxa"/>
+          </w:tcPr>
+          <w:p>
+            <w:r>
+              <w:rPr>
+                <w:rFonts w:ascii="Consolas" w:hAnsi="Consolas"/>
+                <w:sz w:val="16"/>
+              </w:rPr>
+              <w:t>VMS_MODE</w:t>
+            </w:r>
+            <w:r>
+              <w:rPr>
+                <w:sz w:val="18"/>
+              </w:rPr>
+              <w:t xml:space="preserve">, </w:t>
+            </w:r>
+            <w:r>
+              <w:rPr>
+                <w:rFonts w:ascii="Consolas" w:hAnsi="Consolas"/>
+                <w:sz w:val="16"/>
+              </w:rPr>
+              <w:t>VMS_URL</w:t>
+            </w:r>
+            <w:r>
+              <w:rPr>
+                <w:sz w:val="18"/>
+              </w:rPr>
+              <w:t xml:space="preserve">, </w:t>
+            </w:r>
+            <w:r>
+              <w:rPr>
+                <w:rFonts w:ascii="Consolas" w:hAnsi="Consolas"/>
+                <w:sz w:val="16"/>
+              </w:rPr>
+              <w:t>VMS_TOKEN</w:t>
+            </w:r>
+            <w:r>
+              <w:rPr>
+                <w:sz w:val="18"/>
+              </w:rPr>
+              <w:t xml:space="preserve">, </w:t>
+            </w:r>
+            <w:r>
+              <w:rPr>
+                <w:rFonts w:ascii="Consolas" w:hAnsi="Consolas"/>
+                <w:sz w:val="16"/>
+              </w:rPr>
+              <w:t>VMS_LIVE_URL</w:t>
+            </w:r>
+            <w:r>
+              <w:rPr>
+                <w:sz w:val="18"/>
+              </w:rPr>
+              <w:t>…</w:t>
+            </w:r>
+          </w:p>
+        </w:tc>
+        <w:tc>
+          <w:tcPr>
+            <w:tcW w:w="4819" w:type="dxa"/>
+          </w:tcPr>
+          <w:p>
+            <w:r>
+              <w:rPr>
+                <w:sz w:val="18"/>
+              </w:rPr>
+              <w:t xml:space="preserve">видеонаблюдение: </w:t>
+            </w:r>
+            <w:r>
+              <w:rPr>
+                <w:rFonts w:ascii="Consolas" w:hAnsi="Consolas"/>
+                <w:sz w:val="16"/>
+              </w:rPr>
+              <w:t>mock</w:t>
+            </w:r>
+            <w:r>
+              <w:rPr>
+                <w:sz w:val="18"/>
+              </w:rPr>
+              <w:t xml:space="preserve">, </w:t>
+            </w:r>
+            <w:r>
+              <w:rPr>
+                <w:rFonts w:ascii="Consolas" w:hAnsi="Consolas"/>
+                <w:sz w:val="16"/>
+              </w:rPr>
+              <w:t>http</w:t>
+            </w:r>
+            <w:r>
+              <w:rPr>
+                <w:sz w:val="18"/>
+              </w:rPr>
+              <w:t xml:space="preserve"> или </w:t>
+            </w:r>
+            <w:r>
+              <w:rPr>
+                <w:rFonts w:ascii="Consolas" w:hAnsi="Consolas"/>
+                <w:sz w:val="16"/>
+              </w:rPr>
+              <w:t>off</w:t>
+            </w:r>
+            <w:r>
+              <w:rPr>
+                <w:sz w:val="18"/>
+              </w:rPr>
+              <w:t xml:space="preserve"> (раздел 6.7)</w:t>
+            </w:r>
+          </w:p>
+        </w:tc>
+      </w:tr>
+      <w:tr>
+        <w:trPr>
+          <w:jc w:val="center"/>
+        </w:trPr>
+        <w:tc>
+          <w:tcPr>
+            <w:tcW w:w="4819" w:type="dxa"/>
+          </w:tcPr>
+          <w:p>
+            <w:r>
+              <w:rPr>
+                <w:rFonts w:ascii="Consolas" w:hAnsi="Consolas"/>
+                <w:sz w:val="16"/>
+              </w:rPr>
               <w:t>GRAFANA_DB_PASSWORD</w:t>
             </w:r>
           </w:p>
@@ -5185,13 +5275,13 @@
               <w:rPr>
                 <w:sz w:val="18"/>
               </w:rPr>
-              <w:t xml:space="preserve">пароль роли БД только для чтения, под которой Grafana читает витрины </w:t>
-            </w:r>
-            <w:r>
-              <w:rPr>
-                <w:sz w:val="18"/>
-              </w:rPr>
-              <w:t>(раздел 6.8)</w:t>
+              <w:t>пароль роли БД только для чтени</w:t>
+            </w:r>
+            <w:r>
+              <w:rPr>
+                <w:sz w:val="18"/>
+              </w:rPr>
+              <w:t>я, под которой Grafana читает витрины (раздел 6.8)</w:t>
             </w:r>
           </w:p>
         </w:tc>
@@ -5202,7 +5292,7 @@
       <w:pPr>
         <w:pStyle w:val="21"/>
       </w:pPr>
-      <w:bookmarkStart w:id="5" w:name="_Toc241494091"/>
+      <w:bookmarkStart w:id="5" w:name="_Toc241594688"/>
       <w:r>
         <w:t>5. Первый запуск</w:t>
       </w:r>
@@ -5290,10 +5380,7 @@
         <w:pStyle w:val="a0"/>
       </w:pPr>
       <w:r>
-        <w:t>загружает справочники объектов и</w:t>
-      </w:r>
-      <w:r>
-        <w:t xml:space="preserve"> каналов, если они лежат в </w:t>
+        <w:t xml:space="preserve">загружает справочники объектов и каналов, если они лежат в </w:t>
       </w:r>
       <w:r>
         <w:rPr>
@@ -5337,7 +5424,10 @@
         <w:t>check.sh</w:t>
       </w:r>
       <w:r>
-        <w:t xml:space="preserve"> только читает состояние и ничего не меняет. Что он проверяет:</w:t>
+        <w:t xml:space="preserve"> только читает состояние и ничего не меняет</w:t>
+      </w:r>
+      <w:r>
+        <w:t>. Что он проверяет:</w:t>
       </w:r>
     </w:p>
     <w:p>
@@ -5368,6 +5458,7 @@
         <w:pStyle w:val="a0"/>
       </w:pPr>
       <w:r>
+        <w:lastRenderedPageBreak/>
         <w:t>проверки безопасности Django без ошибок;</w:t>
       </w:r>
     </w:p>
@@ -5397,11 +5488,7 @@
     </w:p>
     <w:p>
       <w:r>
-        <w:lastRenderedPageBreak/>
-        <w:t>Все строки д</w:t>
-      </w:r>
-      <w:r>
-        <w:t xml:space="preserve">олжны быть </w:t>
+        <w:t xml:space="preserve">Все строки должны быть </w:t>
       </w:r>
       <w:r>
         <w:rPr>
@@ -5424,7 +5511,10 @@
     </w:p>
     <w:p>
       <w:r>
-        <w:t xml:space="preserve">Справочники кладутся в </w:t>
+        <w:t>Справочники к</w:t>
+      </w:r>
+      <w:r>
+        <w:t xml:space="preserve">ладутся в </w:t>
       </w:r>
       <w:r>
         <w:rPr>
@@ -5470,14 +5560,14 @@
                 <w:rFonts w:ascii="Consolas" w:hAnsi="Consolas"/>
                 <w:sz w:val="17"/>
               </w:rPr>
-              <w:t>docker compos</w:t>
+              <w:t>docker compose run --rm backend python manage.py import_</w:t>
             </w:r>
             <w:r>
               <w:rPr>
                 <w:rFonts w:ascii="Consolas" w:hAnsi="Consolas"/>
                 <w:sz w:val="17"/>
               </w:rPr>
-              <w:t>e run --rm backend python manage.py import_history            # все годы, кроме 2021</w:t>
+              <w:t>history            # все годы, кроме 2021</w:t>
             </w:r>
             <w:r>
               <w:rPr>
@@ -5502,10 +5592,31 @@
     <w:p/>
     <w:p>
       <w:r>
-        <w:t>Импорт занимает 1–2 мин</w:t>
-      </w:r>
-      <w:r>
-        <w:t>уты на год журнала, пиковая память — около 2,3 ГБ. После импорта модель отказа датчиков обучается автоматически (модели газа и подтопления — командами выше), дальше прогноз пересчитывается каждые 15 минут.</w:t>
+        <w:t xml:space="preserve">Импорт занимает 1–2 минуты на год журнала, пиковая память — около </w:t>
+      </w:r>
+      <w:r>
+        <w:t>2,3 ГБ. После импорта модель отказа датчиков обучается автоматически (модели газа и подтопления — командами выше), дальше прогноз пересчитывается каждые 15 минут.</w:t>
+      </w:r>
+    </w:p>
+    <w:p>
+      <w:r>
+        <w:t xml:space="preserve">Модели прогноза поставляются готовыми: отказ датчика, загазованность и </w:t>
+      </w:r>
+      <w:r>
+        <w:t>подтопление, обученные на журналах заказчика 2019–2026 (</w:t>
+      </w:r>
+      <w:r>
+        <w:rPr>
+          <w:rFonts w:ascii="Consolas" w:hAnsi="Consolas"/>
+          <w:sz w:val="20"/>
+        </w:rPr>
+        <w:t>backend/apps/forecasting/pretrained/</w:t>
+      </w:r>
+      <w:r>
+        <w:t>). Первый запуск ставит их активными, если активной модели задачи ещё нет, — прогноз работает сразу, до загрузки истории. Переобучение из интерфейса требует истории</w:t>
+      </w:r>
+      <w:r>
+        <w:t xml:space="preserve"> журналов за несколько лет: без неё запуск завершается с причиной «Недостаточно истории», а поставляемая модель остаётся активной.</w:t>
       </w:r>
     </w:p>
     <w:p>
@@ -5518,10 +5629,7 @@
     </w:p>
     <w:p>
       <w:r>
-        <w:t xml:space="preserve">Администратор или </w:t>
-      </w:r>
-      <w:r>
-        <w:t>руководитель района:</w:t>
+        <w:t>Администратор или руководитель района:</w:t>
       </w:r>
     </w:p>
     <w:p>
@@ -5577,10 +5685,10 @@
         <w:t>Объекты на карте</w:t>
       </w:r>
       <w:r>
-        <w:t xml:space="preserve"> («Зоны и объекты» → «Объекты»): у каждого объект</w:t>
-      </w:r>
-      <w:r>
-        <w:t>а из справочника задаётся контур. Щелчок по зданию выделяет контур автоматически (если подключена подложка или Overpass), иначе контур обводится вручную. В справочниках заказчика координат нет, поэтому это обязательный шаг для карты мониторинга.</w:t>
+        <w:t xml:space="preserve"> («Зоны и объекты» → «Объекты»): у каждого объекта из справочника задаётся контур. Щелчок по зданию выделяет контур автоматически (если</w:t>
+      </w:r>
+      <w:r>
+        <w:t xml:space="preserve"> подключена подложка или Overpass), иначе контур обводится вручную. В справочниках заказчика координат нет, поэтому это обязательный шаг для карты мониторинга.</w:t>
       </w:r>
     </w:p>
     <w:p>
@@ -5594,7 +5702,10 @@
         <w:t>Сотрудники</w:t>
       </w:r>
       <w:r>
-        <w:t xml:space="preserve"> входят под своими учётными записями AD и сразу получают роль и зону. Недостающее назначается на вкладке «Сотрудники».</w:t>
+        <w:t xml:space="preserve"> входят под своими учётными записями AD и сразу получают роль и зону. Недостающее назн</w:t>
+      </w:r>
+      <w:r>
+        <w:t>ачается на вкладке «Сотрудники».</w:t>
       </w:r>
     </w:p>
     <w:p>
@@ -5606,7 +5717,7 @@
       <w:pPr>
         <w:pStyle w:val="21"/>
       </w:pPr>
-      <w:bookmarkStart w:id="6" w:name="_Toc241494092"/>
+      <w:bookmarkStart w:id="6" w:name="_Toc241594689"/>
       <w:r>
         <w:t>6. Подключение источников</w:t>
       </w:r>
@@ -5622,10 +5733,7 @@
     </w:p>
     <w:p>
       <w:r>
-        <w:t xml:space="preserve">Шлюз </w:t>
-      </w:r>
-      <w:r>
-        <w:t xml:space="preserve">СМВУ публикует события в Kafka </w:t>
+        <w:t xml:space="preserve">Шлюз СМВУ публикует события в Kafka </w:t>
       </w:r>
       <w:r>
         <w:rPr>
@@ -5645,7 +5753,10 @@
         <w:t>smvu.raw-events</w:t>
       </w:r>
       <w:r>
-        <w:t>. Одно сообщение — одно событие канала в JSON (UTF-8). Ключ сообщения — ид канала:</w:t>
+        <w:t>. Одно со</w:t>
+      </w:r>
+      <w:r>
+        <w:t>общение — одно событие канала в JSON (UTF-8). Ключ сообщения — ид канала:</w:t>
       </w:r>
     </w:p>
     <w:tbl>
@@ -5679,14 +5790,7 @@
                 <w:sz w:val="17"/>
               </w:rPr>
               <w:br/>
-              <w:t xml:space="preserve"> "raw_val</w:t>
-            </w:r>
-            <w:r>
-              <w:rPr>
-                <w:rFonts w:ascii="Consolas" w:hAnsi="Consolas"/>
-                <w:sz w:val="17"/>
-              </w:rPr>
-              <w:t>ue": "0.8", "raw_alarm": false, "source": "smvu"}</w:t>
+              <w:t xml:space="preserve"> "raw_value": "0.8", "raw_alarm": false, "source": "smvu"}</w:t>
             </w:r>
           </w:p>
         </w:tc>
@@ -5773,7 +5877,14 @@
               <w:rPr>
                 <w:sz w:val="18"/>
               </w:rPr>
-              <w:t>уникальный номер события в СМВУ (повторная доставка не создаёт дублей)</w:t>
+              <w:t xml:space="preserve">уникальный номер события в СМВУ (повторная доставка </w:t>
+            </w:r>
+            <w:r>
+              <w:rPr>
+                <w:sz w:val="18"/>
+              </w:rPr>
+              <w:lastRenderedPageBreak/>
+              <w:t>не создаёт дублей)</w:t>
             </w:r>
           </w:p>
         </w:tc>
@@ -5792,6 +5903,7 @@
                 <w:rFonts w:ascii="Consolas" w:hAnsi="Consolas"/>
                 <w:sz w:val="16"/>
               </w:rPr>
+              <w:lastRenderedPageBreak/>
               <w:t>channel_external_id</w:t>
             </w:r>
           </w:p>
@@ -5869,7 +5981,13 @@
               <w:rPr>
                 <w:sz w:val="18"/>
               </w:rPr>
-              <w:t>«сырое» значение как в журнале СМВУ; служебные коды распознаются профилями нормализации</w:t>
+              <w:t>«сырое» значение как в журнале СМВУ; служебные коды распознаются профилями нормализац</w:t>
+            </w:r>
+            <w:r>
+              <w:rPr>
+                <w:sz w:val="18"/>
+              </w:rPr>
+              <w:t>ии</w:t>
             </w:r>
           </w:p>
         </w:tc>
@@ -5910,10 +6028,7 @@
     <w:p/>
     <w:p>
       <w:r>
-        <w:t>Проверка: в Grafana (системный дашборд) растёт число принятых событий, а задержка потока держится в пределах секунд</w:t>
-      </w:r>
-      <w:r>
-        <w:t xml:space="preserve">. Журнал приёма: </w:t>
+        <w:t xml:space="preserve">Проверка: в Grafana (системный дашборд) растёт число принятых событий, а задержка потока держится в пределах секунд. Журнал приёма: </w:t>
       </w:r>
       <w:r>
         <w:rPr>
@@ -5928,7 +6043,6 @@
     </w:p>
     <w:p>
       <w:r>
-        <w:lastRenderedPageBreak/>
         <w:t xml:space="preserve">Слушатель 9094 без шифрования. Доступ к нему открывается на межсетевом экране только для адреса шлюза. Если политика заказчика требует TLS или SASL на этом участке, слушатель </w:t>
       </w:r>
       <w:r>
@@ -5946,14 +6060,7 @@
           <w:rFonts w:ascii="Consolas" w:hAnsi="Consolas"/>
           <w:sz w:val="20"/>
         </w:rPr>
-        <w:t>infra/deploy/docker-</w:t>
-      </w:r>
-      <w:r>
-        <w:rPr>
-          <w:rFonts w:ascii="Consolas" w:hAnsi="Consolas"/>
-          <w:sz w:val="20"/>
-        </w:rPr>
-        <w:t>compose.customer.yml</w:t>
+        <w:t>infra/deploy/docker-compose.customer.yml</w:t>
       </w:r>
       <w:r>
         <w:t xml:space="preserve"> переводится на </w:t>
@@ -5973,7 +6080,14 @@
           <w:rFonts w:ascii="Consolas" w:hAnsi="Consolas"/>
           <w:sz w:val="20"/>
         </w:rPr>
-        <w:t>SASL_SSL</w:t>
+        <w:t>SASL_S</w:t>
+      </w:r>
+      <w:r>
+        <w:rPr>
+          <w:rFonts w:ascii="Consolas" w:hAnsi="Consolas"/>
+          <w:sz w:val="20"/>
+        </w:rPr>
+        <w:t>SL</w:t>
       </w:r>
       <w:r>
         <w:t>.</w:t>
@@ -5997,15 +6111,15 @@
         <w:pStyle w:val="31"/>
       </w:pPr>
       <w:r>
-        <w:t xml:space="preserve">6.3 Карта мониторинга в закрытом </w:t>
-      </w:r>
-      <w:r>
-        <w:t>контуре</w:t>
+        <w:t>6.3 Карта мониторинга в закрытом контуре</w:t>
       </w:r>
     </w:p>
     <w:p>
       <w:r>
-        <w:t>Подложка — векторные тайлы OpenStreetMap, их запрашивает браузер пользователя. Варианты:</w:t>
+        <w:t xml:space="preserve">Подложка — векторные тайлы OpenStreetMap, </w:t>
+      </w:r>
+      <w:r>
+        <w:t>их запрашивает браузер пользователя. Варианты:</w:t>
       </w:r>
     </w:p>
     <w:tbl>
@@ -6183,14 +6297,7 @@
                 <w:rFonts w:ascii="Consolas" w:hAnsi="Consolas"/>
                 <w:sz w:val="16"/>
               </w:rPr>
-              <w:t>MAP_ST</w:t>
-            </w:r>
-            <w:r>
-              <w:rPr>
-                <w:rFonts w:ascii="Consolas" w:hAnsi="Consolas"/>
-                <w:sz w:val="16"/>
-              </w:rPr>
-              <w:t>YLE_LIGHT/DARK</w:t>
+              <w:t>MAP_STYLE_LIGHT/DARK</w:t>
             </w:r>
             <w:r>
               <w:rPr>
@@ -6205,7 +6312,10 @@
     <w:p/>
     <w:p>
       <w:r>
-        <w:t>Автовыделение здания берёт контур прямо из подложки, поэтому со своим сервером тайлов оно работает без Overpass. Overpass (</w:t>
+        <w:t xml:space="preserve">Автовыделение здания берёт контур прямо из подложки, поэтому со своим </w:t>
+      </w:r>
+      <w:r>
+        <w:t>сервером тайлов оно работает без Overpass. Overpass (</w:t>
       </w:r>
       <w:r>
         <w:rPr>
@@ -6215,74 +6325,54 @@
         <w:t>OVERPASS_URL</w:t>
       </w:r>
       <w:r>
-        <w:t>) — запасной путь, его запросы идут с сервера. Е</w:t>
-      </w:r>
-      <w:r>
-        <w:t>сли подложки нет, контуры объектов обводятся вручную.</w:t>
+        <w:t>) — запасной путь, его запросы идут с сервера. Если подложки нет, контуры объектов обводятся вручную.</w:t>
       </w:r>
     </w:p>
     <w:p>
       <w:r>
-        <w:t xml:space="preserve">После изменения этих переменных выполните </w:t>
+        <w:rPr>
+          <w:b/>
+        </w:rPr>
+        <w:t>Спутниковый снимок и ИИ-выделение зданий.</w:t>
+      </w:r>
+      <w:r>
+        <w:t xml:space="preserve"> Редактор объектов показывает спутниковую подлож</w:t>
+      </w:r>
+      <w:r>
+        <w:t>ку (</w:t>
       </w:r>
       <w:r>
         <w:rPr>
           <w:rFonts w:ascii="Consolas" w:hAnsi="Consolas"/>
           <w:sz w:val="20"/>
         </w:rPr>
-        <w:t>docker compose up -d</w:t>
-      </w:r>
-      <w:r>
-        <w:t>: пересоздадутся контейнеры с изменённым окружением.</w:t>
-      </w:r>
-    </w:p>
-    <w:p>
-      <w:pPr>
-        <w:pStyle w:val="31"/>
-      </w:pPr>
-      <w:r>
-        <w:t>6.4 Погода</w:t>
-      </w:r>
-    </w:p>
-    <w:p>
-      <w:r>
-        <w:t xml:space="preserve">Погоду раз в 6 часов загружает задача «Погода Open-Meteo» — ей нужен доступ </w:t>
-      </w:r>
-      <w:r>
-        <w:t xml:space="preserve">сервера к </w:t>
+        <w:t>MAP_SATELLITE_TILES</w:t>
+      </w:r>
+      <w:r>
+        <w:t xml:space="preserve">, растровые XYZ-тайлы) — на ней привязываются планы этажей. Выделение здания по снимку делает отдельный сервис </w:t>
       </w:r>
       <w:r>
         <w:rPr>
           <w:rFonts w:ascii="Consolas" w:hAnsi="Consolas"/>
           <w:sz w:val="20"/>
         </w:rPr>
-        <w:t>archive-api.open-meteo.com</w:t>
-      </w:r>
-      <w:r>
-        <w:t>. Без интернета задача выключается в админке: «Periodic tasks» → снять «Enabled». Модели работают и без погоды, прирост от неё в пределах шума.</w:t>
-      </w:r>
-    </w:p>
-    <w:p>
-      <w:pPr>
-        <w:pStyle w:val="31"/>
-      </w:pPr>
-      <w:r>
-        <w:t>6.5 Система учёта заявок</w:t>
-      </w:r>
-    </w:p>
-    <w:p>
-      <w:r>
-        <w:t xml:space="preserve">По умолчанию контур работает с эмулятором </w:t>
+        <w:t>segmenter</w:t>
+      </w:r>
+      <w:r>
+        <w:t xml:space="preserve"> (Segment Anything, CPU): образ около 2 ГБ, память около 1,5 ГБ, ответ 5–15 с, первый запрос — до 40 с (загрузка </w:t>
+      </w:r>
+      <w:r>
+        <w:t xml:space="preserve">модели). Он в профиле </w:t>
       </w:r>
       <w:r>
         <w:rPr>
           <w:rFonts w:ascii="Consolas" w:hAnsi="Consolas"/>
           <w:sz w:val="20"/>
         </w:rPr>
-        <w:t>mock-helpdesk</w:t>
-      </w:r>
-      <w:r>
-        <w:t>. Для help desk заказчика:</w:t>
+        <w:t>ai</w:t>
+      </w:r>
+      <w:r>
+        <w:t>:</w:t>
       </w:r>
     </w:p>
     <w:tbl>
@@ -6308,70 +6398,7 @@
                 <w:rFonts w:ascii="Consolas" w:hAnsi="Consolas"/>
                 <w:sz w:val="17"/>
               </w:rPr>
-              <w:t>HELPDESK_MODE=rest</w:t>
-            </w:r>
-            <w:r>
-              <w:rPr>
-                <w:rFonts w:ascii="Consolas" w:hAnsi="Consolas"/>
-                <w:sz w:val="17"/>
-              </w:rPr>
-              <w:br/>
-              <w:t>HELPDESK_URL=https://helpdesk.corp.local</w:t>
-            </w:r>
-            <w:r>
-              <w:rPr>
-                <w:rFonts w:ascii="Consolas" w:hAnsi="Consolas"/>
-                <w:sz w:val="17"/>
-              </w:rPr>
-              <w:br/>
-              <w:t>HELPDESK_TOKEN=&lt;токен сервисной учётки&gt;</w:t>
-            </w:r>
-            <w:r>
-              <w:rPr>
-                <w:rFonts w:ascii="Consolas" w:hAnsi="Consolas"/>
-                <w:sz w:val="17"/>
-              </w:rPr>
-              <w:br/>
-              <w:t>HELPDESK_AUTH_SCHEME=Token                      # Bearer | Token | Basic</w:t>
-            </w:r>
-            <w:r>
-              <w:rPr>
-                <w:rFonts w:ascii="Consolas" w:hAnsi="Consolas"/>
-                <w:sz w:val="17"/>
-              </w:rPr>
-              <w:br/>
-              <w:t>H</w:t>
-            </w:r>
-            <w:r>
-              <w:rPr>
-                <w:rFonts w:ascii="Consolas" w:hAnsi="Consolas"/>
-                <w:sz w:val="17"/>
-              </w:rPr>
-              <w:t>ELPDESK_SUBMIT_PATH=/api/tickets/</w:t>
-            </w:r>
-            <w:r>
-              <w:rPr>
-                <w:rFonts w:ascii="Consolas" w:hAnsi="Consolas"/>
-                <w:sz w:val="17"/>
-              </w:rPr>
-              <w:br/>
-              <w:t>HELPDESK_STATUS_PATH=/api/tickets/statuses/</w:t>
-            </w:r>
-            <w:r>
-              <w:rPr>
-                <w:rFonts w:ascii="Consolas" w:hAnsi="Consolas"/>
-                <w:sz w:val="17"/>
-              </w:rPr>
-              <w:br/>
-              <w:t>HELPDESK_STATUS_MAP={"Исполнено":"done","В работе":"in_progress","Назначена":"assigned"}</w:t>
-            </w:r>
-            <w:r>
-              <w:rPr>
-                <w:rFonts w:ascii="Consolas" w:hAnsi="Consolas"/>
-                <w:sz w:val="17"/>
-              </w:rPr>
-              <w:br/>
-              <w:t>HELPDESK_CA_CERT=/certs/corp-ca.pem</w:t>
+              <w:t>docker compose --profile ai up -d --build segmenter</w:t>
             </w:r>
           </w:p>
         </w:tc>
@@ -6380,34 +6407,45 @@
     <w:p/>
     <w:p>
       <w:r>
-        <w:t xml:space="preserve">Контракт API и соответствие статусов описаны в </w:t>
+        <w:t xml:space="preserve">Без сервиса кнопка «По снимку (ИИ)» берёт контур из OpenStreetMap и сообщает об этом. В закрытом контуре укажите свой сервер спутниковых тайлов в </w:t>
       </w:r>
       <w:r>
         <w:rPr>
           <w:rFonts w:ascii="Consolas" w:hAnsi="Consolas"/>
           <w:sz w:val="20"/>
         </w:rPr>
-        <w:t>docs</w:t>
+        <w:t>MAP_SATELLITE_TILES</w:t>
+      </w:r>
+      <w:r>
+        <w:t>: его испол</w:t>
+      </w:r>
+      <w:r>
+        <w:t xml:space="preserve">ьзует и браузер, и </w:t>
       </w:r>
       <w:r>
         <w:rPr>
           <w:rFonts w:ascii="Consolas" w:hAnsi="Consolas"/>
           <w:sz w:val="20"/>
         </w:rPr>
-        <w:t>/integrations.md</w:t>
-      </w:r>
-      <w:r>
-        <w:t xml:space="preserve">. Если система не готова, укажите </w:t>
+        <w:t>segmenter</w:t>
+      </w:r>
+      <w:r>
+        <w:t>.</w:t>
+      </w:r>
+    </w:p>
+    <w:p>
+      <w:r>
+        <w:t xml:space="preserve">После изменения этих переменных выполните </w:t>
       </w:r>
       <w:r>
         <w:rPr>
           <w:rFonts w:ascii="Consolas" w:hAnsi="Consolas"/>
           <w:sz w:val="20"/>
         </w:rPr>
-        <w:t>HELPDESK_MODE=off</w:t>
-      </w:r>
-      <w:r>
-        <w:t>: заявки остаются в системе, статусы ведёт бригада. Проверка — страница «Интеграции» → «Проверить связь».</w:t>
+        <w:t>docker compose up -d</w:t>
+      </w:r>
+      <w:r>
+        <w:t>: пересоздадутся контейнеры с изменённым окружением.</w:t>
       </w:r>
     </w:p>
     <w:p>
@@ -6415,63 +6453,23 @@
         <w:pStyle w:val="31"/>
       </w:pPr>
       <w:r>
-        <w:t>6.6 Реестр оборудования</w:t>
+        <w:lastRenderedPageBreak/>
+        <w:t>6.4 Погода</w:t>
       </w:r>
     </w:p>
     <w:p>
       <w:r>
-        <w:t xml:space="preserve">Пока реестра нет, работает эмуляция по каналам. Выгрузку учётной системы (CSV или XLSX по шаблону) загружает администратор на странице «Интеграции» или инженер ТО в «Реестре </w:t>
-      </w:r>
-      <w:r>
-        <w:lastRenderedPageBreak/>
-        <w:t xml:space="preserve">оборудования». Для ежедневной синхронизации по API задайте </w:t>
+        <w:t xml:space="preserve">Погоду раз в 6 часов загружает задача «Погода Open-Meteo» — ей нужен доступ сервера к </w:t>
       </w:r>
       <w:r>
         <w:rPr>
           <w:rFonts w:ascii="Consolas" w:hAnsi="Consolas"/>
           <w:sz w:val="20"/>
         </w:rPr>
-        <w:t>REGISTRY_MODE=api</w:t>
-      </w:r>
-      <w:r>
-        <w:t xml:space="preserve">, </w:t>
-      </w:r>
-      <w:r>
-        <w:rPr>
-          <w:rFonts w:ascii="Consolas" w:hAnsi="Consolas"/>
-          <w:sz w:val="20"/>
-        </w:rPr>
-        <w:t>REGI</w:t>
-      </w:r>
-      <w:r>
-        <w:rPr>
-          <w:rFonts w:ascii="Consolas" w:hAnsi="Consolas"/>
-          <w:sz w:val="20"/>
-        </w:rPr>
-        <w:t>STRY_URL</w:t>
-      </w:r>
-      <w:r>
-        <w:t xml:space="preserve">, </w:t>
-      </w:r>
-      <w:r>
-        <w:rPr>
-          <w:rFonts w:ascii="Consolas" w:hAnsi="Consolas"/>
-          <w:sz w:val="20"/>
-        </w:rPr>
-        <w:t>REGISTRY_TOKEN</w:t>
-      </w:r>
-      <w:r>
-        <w:t xml:space="preserve"> (при необходимости </w:t>
-      </w:r>
-      <w:r>
-        <w:rPr>
-          <w:rFonts w:ascii="Consolas" w:hAnsi="Consolas"/>
-          <w:sz w:val="20"/>
-        </w:rPr>
-        <w:t>REGISTRY_CA_CERT</w:t>
-      </w:r>
-      <w:r>
-        <w:t>). Эмулированные записи удаляются при первой успешной загрузке.</w:t>
+        <w:t>archive-api.open-meteo.com</w:t>
+      </w:r>
+      <w:r>
+        <w:t>. Без интернета задача выключается в админке: «Periodic tasks» → снять «Enabled». Модели работают и без погоды, прирост от неё в пределах шума.</w:t>
       </w:r>
     </w:p>
     <w:p>
@@ -6479,15 +6477,22 @@
         <w:pStyle w:val="31"/>
       </w:pPr>
       <w:r>
-        <w:t>6.7 Видеонаблюдение</w:t>
+        <w:t>6.5 Система учёта заявок</w:t>
       </w:r>
     </w:p>
     <w:p>
       <w:r>
-        <w:t>Камеры заводятся в администрировании («Камеры видеонаблюдения»): объект, пикет, ид камеры в системе видеонаблюде</w:t>
-      </w:r>
-      <w:r>
-        <w:t>ния. Подключение VMS заказчика:</w:t>
+        <w:t xml:space="preserve">По умолчанию контур работает с эмулятором </w:t>
+      </w:r>
+      <w:r>
+        <w:rPr>
+          <w:rFonts w:ascii="Consolas" w:hAnsi="Consolas"/>
+          <w:sz w:val="20"/>
+        </w:rPr>
+        <w:t>mock-helpdesk</w:t>
+      </w:r>
+      <w:r>
+        <w:t>. Для help desk заказчика:</w:t>
       </w:r>
     </w:p>
     <w:tbl>
@@ -6513,7 +6518,7 @@
                 <w:rFonts w:ascii="Consolas" w:hAnsi="Consolas"/>
                 <w:sz w:val="17"/>
               </w:rPr>
-              <w:t>VMS_MODE=http</w:t>
+              <w:t>HELPDESK_MODE=rest</w:t>
             </w:r>
             <w:r>
               <w:rPr>
@@ -6521,7 +6526,7 @@
                 <w:sz w:val="17"/>
               </w:rPr>
               <w:br/>
-              <w:t>VMS_URL=https://vms.corp.local</w:t>
+              <w:t>HELPDESK_URL=https://helpdesk.corp.local</w:t>
             </w:r>
             <w:r>
               <w:rPr>
@@ -6529,7 +6534,7 @@
                 <w:sz w:val="17"/>
               </w:rPr>
               <w:br/>
-              <w:t>VMS_TOKEN=&lt;токен только на чтение&gt;</w:t>
+              <w:t>HELPDESK_TOKEN=&lt;токен сервисной учётки&gt;</w:t>
             </w:r>
             <w:r>
               <w:rPr>
@@ -6537,15 +6542,46 @@
                 <w:sz w:val="17"/>
               </w:rPr>
               <w:br/>
-              <w:t>VMS_SNAPSHOT_PATH=/api/cameras/{id}/snapshot    # параметр at — момент кадра (ISO 8601)</w:t>
+              <w:t>HELPDESK_AUTH_SCHEME=Token                      #</w:t>
             </w:r>
             <w:r>
               <w:rPr>
                 <w:rFonts w:ascii="Consolas" w:hAnsi="Consolas"/>
                 <w:sz w:val="17"/>
               </w:rPr>
+              <w:t xml:space="preserve"> Bearer | Token | Basic</w:t>
+            </w:r>
+            <w:r>
+              <w:rPr>
+                <w:rFonts w:ascii="Consolas" w:hAnsi="Consolas"/>
+                <w:sz w:val="17"/>
+              </w:rPr>
               <w:br/>
-              <w:t>VMS_LIVE_URL=https://vms.corp.local/live/{id}?t={at}</w:t>
+              <w:t>HELPDESK_SUBMIT_PATH=/api/tickets/</w:t>
+            </w:r>
+            <w:r>
+              <w:rPr>
+                <w:rFonts w:ascii="Consolas" w:hAnsi="Consolas"/>
+                <w:sz w:val="17"/>
+              </w:rPr>
+              <w:br/>
+              <w:t>HELPDESK_STATUS_PATH=/api/tickets/statuses/</w:t>
+            </w:r>
+            <w:r>
+              <w:rPr>
+                <w:rFonts w:ascii="Consolas" w:hAnsi="Consolas"/>
+                <w:sz w:val="17"/>
+              </w:rPr>
+              <w:br/>
+              <w:t>HELPDESK_STATUS_MAP={"Исполнено":"done","В работе":"in_progress","Назначена":"assigned"}</w:t>
+            </w:r>
+            <w:r>
+              <w:rPr>
+                <w:rFonts w:ascii="Consolas" w:hAnsi="Consolas"/>
+                <w:sz w:val="17"/>
+              </w:rPr>
+              <w:br/>
+              <w:t>HELPDESK_CA_CERT=/certs/corp-ca.pem</w:t>
             </w:r>
           </w:p>
         </w:tc>
@@ -6554,40 +6590,30 @@
     <w:p/>
     <w:p>
       <w:r>
-        <w:t>С</w:t>
-      </w:r>
-      <w:r>
-        <w:t xml:space="preserve">ервис </w:t>
+        <w:t>Контракт API и соответстви</w:t>
+      </w:r>
+      <w:r>
+        <w:t xml:space="preserve">е статусов описаны в </w:t>
       </w:r>
       <w:r>
         <w:rPr>
           <w:rFonts w:ascii="Consolas" w:hAnsi="Consolas"/>
           <w:sz w:val="20"/>
         </w:rPr>
-        <w:t>mock-vms</w:t>
-      </w:r>
-      <w:r>
-        <w:t xml:space="preserve"> в контуре заказчика не нужен: </w:t>
+        <w:t>docs/integrations.md</w:t>
+      </w:r>
+      <w:r>
+        <w:t xml:space="preserve">. Если система не готова, укажите </w:t>
       </w:r>
       <w:r>
         <w:rPr>
           <w:rFonts w:ascii="Consolas" w:hAnsi="Consolas"/>
           <w:sz w:val="20"/>
         </w:rPr>
-        <w:t>docker compose stop mock-vms</w:t>
-      </w:r>
-      <w:r>
-        <w:t xml:space="preserve">. </w:t>
-      </w:r>
-      <w:r>
-        <w:rPr>
-          <w:rFonts w:ascii="Consolas" w:hAnsi="Consolas"/>
-          <w:sz w:val="20"/>
-        </w:rPr>
-        <w:t>VMS_MODE=off</w:t>
-      </w:r>
-      <w:r>
-        <w:t xml:space="preserve"> убирает блок камер из карточек.</w:t>
+        <w:t>HELPDESK_MODE=off</w:t>
+      </w:r>
+      <w:r>
+        <w:t>: заявки остаются в системе, статусы ведёт бригада. Проверка — страница «Интеграции» → «Проверить связь».</w:t>
       </w:r>
     </w:p>
     <w:p>
@@ -6595,126 +6621,71 @@
         <w:pStyle w:val="31"/>
       </w:pPr>
       <w:r>
-        <w:t>6.8 Grafana и Prometheus</w:t>
+        <w:t>6.6 Реестр оборудования</w:t>
       </w:r>
     </w:p>
     <w:p>
       <w:r>
-        <w:t>Вход — через учётную запись системы. Администратор видит всё, аналитик — бизнес-панели. Форма входа Grafana вык</w:t>
-      </w:r>
-      <w:r>
-        <w:t xml:space="preserve">лючена. Пароль </w:t>
+        <w:t>Пока реестра нет, работает эмуляци</w:t>
+      </w:r>
+      <w:r>
+        <w:t xml:space="preserve">я по каналам. Выгрузку учётной системы (CSV или XLSX по шаблону) загружает администратор на странице «Интеграции» или инженер ТО в «Реестре оборудования». Для ежедневной синхронизации по API задайте </w:t>
       </w:r>
       <w:r>
         <w:rPr>
           <w:rFonts w:ascii="Consolas" w:hAnsi="Consolas"/>
           <w:sz w:val="20"/>
         </w:rPr>
-        <w:t>GRAFANA_ADMIN_PASSWORD</w:t>
-      </w:r>
-      <w:r>
-        <w:t xml:space="preserve"> нужен только сервису </w:t>
+        <w:t>REGISTRY_MODE=api</w:t>
+      </w:r>
+      <w:r>
+        <w:t xml:space="preserve">, </w:t>
       </w:r>
       <w:r>
         <w:rPr>
           <w:rFonts w:ascii="Consolas" w:hAnsi="Consolas"/>
           <w:sz w:val="20"/>
         </w:rPr>
-        <w:t>grafana-init</w:t>
-      </w:r>
-      <w:r>
-        <w:t xml:space="preserve">: он выставляет права папок. Витрины Grafana читает ролью </w:t>
+        <w:t>REGISTRY_URL</w:t>
+      </w:r>
+      <w:r>
+        <w:t xml:space="preserve">, </w:t>
       </w:r>
       <w:r>
         <w:rPr>
           <w:rFonts w:ascii="Consolas" w:hAnsi="Consolas"/>
           <w:sz w:val="20"/>
         </w:rPr>
-        <w:t>grafana_reader</w:t>
-      </w:r>
-      <w:r>
-        <w:t xml:space="preserve"> с доступом только на чтение к таблицам панелей. Задайте ей свой пароль </w:t>
+        <w:t>REGISTRY_TOKEN</w:t>
+      </w:r>
+      <w:r>
+        <w:t xml:space="preserve"> (при необ</w:t>
+      </w:r>
+      <w:r>
+        <w:t xml:space="preserve">ходимости </w:t>
       </w:r>
       <w:r>
         <w:rPr>
           <w:rFonts w:ascii="Consolas" w:hAnsi="Consolas"/>
           <w:sz w:val="20"/>
         </w:rPr>
-        <w:t>GRAFANA_DB_PASSWORD</w:t>
-      </w:r>
-      <w:r>
-        <w:t xml:space="preserve"> в </w:t>
-      </w:r>
-      <w:r>
-        <w:rPr>
-          <w:rFonts w:ascii="Consolas" w:hAnsi="Consolas"/>
-          <w:sz w:val="20"/>
-        </w:rPr>
-        <w:t>.env</w:t>
-      </w:r>
-      <w:r>
-        <w:t xml:space="preserve"> до первого зап</w:t>
-      </w:r>
-      <w:r>
-        <w:t xml:space="preserve">уска или перезапустите </w:t>
-      </w:r>
-      <w:r>
-        <w:rPr>
-          <w:rFonts w:ascii="Consolas" w:hAnsi="Consolas"/>
-          <w:sz w:val="20"/>
-        </w:rPr>
-        <w:t>migrate</w:t>
-      </w:r>
-      <w:r>
-        <w:t xml:space="preserve"> и </w:t>
-      </w:r>
-      <w:r>
-        <w:rPr>
-          <w:rFonts w:ascii="Consolas" w:hAnsi="Consolas"/>
-          <w:sz w:val="20"/>
-        </w:rPr>
-        <w:t>grafana</w:t>
-      </w:r>
-      <w:r>
-        <w:t xml:space="preserve"> после смены пароля.</w:t>
+        <w:t>REGISTRY_CA_CERT</w:t>
+      </w:r>
+      <w:r>
+        <w:t>). Эмулированные записи удаляются при первой успешной загрузке.</w:t>
       </w:r>
     </w:p>
     <w:p>
       <w:pPr>
-        <w:pStyle w:val="21"/>
+        <w:pStyle w:val="31"/>
       </w:pPr>
-      <w:bookmarkStart w:id="7" w:name="_Toc241494093"/>
-      <w:r>
-        <w:t>7. Учебный контур</w:t>
-      </w:r>
-      <w:bookmarkEnd w:id="7"/>
+      <w:r>
+        <w:t>6.7 Видеонаблюдение</w:t>
+      </w:r>
     </w:p>
     <w:p>
       <w:r>
-        <w:t>Подсистема на том же адресе: https://forecast.corp.local/training/. Своя база, Redis, тема Kafka и help desk, боевые данные ей не видны. Вход и учётные записи общие с основной с</w:t>
-      </w:r>
-      <w:r>
-        <w:t>истемой: учебный контур читает их из её базы (</w:t>
-      </w:r>
-      <w:r>
-        <w:rPr>
-          <w:rFonts w:ascii="Consolas" w:hAnsi="Consolas"/>
-          <w:sz w:val="20"/>
-        </w:rPr>
-        <w:t>IDENTITY_DATABASE_URL</w:t>
-      </w:r>
-      <w:r>
-        <w:t xml:space="preserve"> задан в </w:t>
-      </w:r>
-      <w:r>
-        <w:rPr>
-          <w:rFonts w:ascii="Consolas" w:hAnsi="Consolas"/>
-          <w:sz w:val="20"/>
-        </w:rPr>
-        <w:t>docker-compose.yml</w:t>
-      </w:r>
-      <w:r>
-        <w:t>), отдельно заводить пользователей не нужно (см. главу «Единая платформа»).</w:t>
+        <w:t>Камеры заводятся в администрировании («Камеры видеонаблюдения»): объект, пикет, ид камеры в системе видеонаблюдения. Подключение VMS заказчика:</w:t>
       </w:r>
     </w:p>
     <w:tbl>
@@ -6740,13 +6711,291 @@
                 <w:rFonts w:ascii="Consolas" w:hAnsi="Consolas"/>
                 <w:sz w:val="17"/>
               </w:rPr>
-              <w:t>docker compose --profile training up -d</w:t>
+              <w:t>VM</w:t>
+            </w:r>
+            <w:r>
+              <w:rPr>
+                <w:rFonts w:ascii="Consolas" w:hAnsi="Consolas"/>
+                <w:sz w:val="17"/>
+              </w:rPr>
+              <w:t>S_MODE=http</w:t>
+            </w:r>
+            <w:r>
+              <w:rPr>
+                <w:rFonts w:ascii="Consolas" w:hAnsi="Consolas"/>
+                <w:sz w:val="17"/>
+              </w:rPr>
+              <w:br/>
+              <w:t>VMS_URL=https://vms.corp.local</w:t>
+            </w:r>
+            <w:r>
+              <w:rPr>
+                <w:rFonts w:ascii="Consolas" w:hAnsi="Consolas"/>
+                <w:sz w:val="17"/>
+              </w:rPr>
+              <w:br/>
+              <w:t>VMS_TOKEN=&lt;токен только на чтение&gt;</w:t>
+            </w:r>
+            <w:r>
+              <w:rPr>
+                <w:rFonts w:ascii="Consolas" w:hAnsi="Consolas"/>
+                <w:sz w:val="17"/>
+              </w:rPr>
+              <w:br/>
+              <w:t>VMS_SNAPSHOT_PATH=/api/cameras/{id}/snapshot    # параметр at — момент кадра (ISO 8601)</w:t>
+            </w:r>
+            <w:r>
+              <w:rPr>
+                <w:rFonts w:ascii="Consolas" w:hAnsi="Consolas"/>
+                <w:sz w:val="17"/>
+              </w:rPr>
+              <w:br/>
+              <w:t>VMS_LIVE_URL=https://vms.corp.local/live/{id}?t={at}</w:t>
             </w:r>
           </w:p>
         </w:tc>
       </w:tr>
     </w:tbl>
     <w:p/>
+    <w:p>
+      <w:r>
+        <w:t xml:space="preserve">Сервис </w:t>
+      </w:r>
+      <w:r>
+        <w:rPr>
+          <w:rFonts w:ascii="Consolas" w:hAnsi="Consolas"/>
+          <w:sz w:val="20"/>
+        </w:rPr>
+        <w:t>mock-vms</w:t>
+      </w:r>
+      <w:r>
+        <w:t xml:space="preserve"> в контуре заказчика не нужен: </w:t>
+      </w:r>
+      <w:r>
+        <w:rPr>
+          <w:rFonts w:ascii="Consolas" w:hAnsi="Consolas"/>
+          <w:sz w:val="20"/>
+        </w:rPr>
+        <w:t>docker compose stop mock-vms</w:t>
+      </w:r>
+      <w:r>
+        <w:t xml:space="preserve">. </w:t>
+      </w:r>
+      <w:r>
+        <w:rPr>
+          <w:rFonts w:ascii="Consolas" w:hAnsi="Consolas"/>
+          <w:sz w:val="20"/>
+        </w:rPr>
+        <w:t>VMS_MODE=off</w:t>
+      </w:r>
+      <w:r>
+        <w:t xml:space="preserve"> убирает блок камер из карточек.</w:t>
+      </w:r>
+    </w:p>
+    <w:p>
+      <w:pPr>
+        <w:pStyle w:val="31"/>
+      </w:pPr>
+      <w:r>
+        <w:t>6.8 Grafana и Prometheus</w:t>
+      </w:r>
+    </w:p>
+    <w:p>
+      <w:r>
+        <w:t>Вход — через учётную запись системы. Администратор видит всё, аналитик — бизнес-панели. Форма входа Grafana выключена. Пароль</w:t>
+      </w:r>
+      <w:r>
+        <w:t xml:space="preserve"> </w:t>
+      </w:r>
+      <w:r>
+        <w:rPr>
+          <w:rFonts w:ascii="Consolas" w:hAnsi="Consolas"/>
+          <w:sz w:val="20"/>
+        </w:rPr>
+        <w:t>GRAFANA_ADMIN_PASSWORD</w:t>
+      </w:r>
+      <w:r>
+        <w:t xml:space="preserve"> нужен только сервису </w:t>
+      </w:r>
+      <w:r>
+        <w:rPr>
+          <w:rFonts w:ascii="Consolas" w:hAnsi="Consolas"/>
+          <w:sz w:val="20"/>
+        </w:rPr>
+        <w:t>grafana-init</w:t>
+      </w:r>
+      <w:r>
+        <w:t xml:space="preserve">: он выставляет права папок. Витрины Grafana читает ролью </w:t>
+      </w:r>
+      <w:r>
+        <w:rPr>
+          <w:rFonts w:ascii="Consolas" w:hAnsi="Consolas"/>
+          <w:sz w:val="20"/>
+        </w:rPr>
+        <w:t>grafana_reader</w:t>
+      </w:r>
+      <w:r>
+        <w:t xml:space="preserve"> с доступом только на чтение к таблицам панелей. Задайте ей свой пароль </w:t>
+      </w:r>
+      <w:r>
+        <w:rPr>
+          <w:rFonts w:ascii="Consolas" w:hAnsi="Consolas"/>
+          <w:sz w:val="20"/>
+        </w:rPr>
+        <w:t>GRAFANA_DB_PASSWORD</w:t>
+      </w:r>
+      <w:r>
+        <w:t xml:space="preserve"> в </w:t>
+      </w:r>
+      <w:r>
+        <w:rPr>
+          <w:rFonts w:ascii="Consolas" w:hAnsi="Consolas"/>
+          <w:sz w:val="20"/>
+        </w:rPr>
+        <w:t>.env</w:t>
+      </w:r>
+      <w:r>
+        <w:t xml:space="preserve"> до первого запуска или перез</w:t>
+      </w:r>
+      <w:r>
+        <w:t xml:space="preserve">апустите </w:t>
+      </w:r>
+      <w:r>
+        <w:rPr>
+          <w:rFonts w:ascii="Consolas" w:hAnsi="Consolas"/>
+          <w:sz w:val="20"/>
+        </w:rPr>
+        <w:t>migrate</w:t>
+      </w:r>
+      <w:r>
+        <w:t xml:space="preserve"> и </w:t>
+      </w:r>
+      <w:r>
+        <w:rPr>
+          <w:rFonts w:ascii="Consolas" w:hAnsi="Consolas"/>
+          <w:sz w:val="20"/>
+        </w:rPr>
+        <w:t>grafana</w:t>
+      </w:r>
+      <w:r>
+        <w:t xml:space="preserve"> после смены пароля.</w:t>
+      </w:r>
+    </w:p>
+    <w:p>
+      <w:r>
+        <w:t xml:space="preserve">Grafana ходит в Prometheus по адресу </w:t>
+      </w:r>
+      <w:r>
+        <w:rPr>
+          <w:rFonts w:ascii="Consolas" w:hAnsi="Consolas"/>
+          <w:sz w:val="20"/>
+        </w:rPr>
+        <w:t>http://prometheus:9090/prometheus</w:t>
+      </w:r>
+      <w:r>
+        <w:t xml:space="preserve">: Prometheus опубликован под </w:t>
+      </w:r>
+      <w:r>
+        <w:rPr>
+          <w:rFonts w:ascii="Consolas" w:hAnsi="Consolas"/>
+          <w:sz w:val="20"/>
+        </w:rPr>
+        <w:t>/prometheus/</w:t>
+      </w:r>
+      <w:r>
+        <w:t xml:space="preserve">, и его API — под тем же префиксом. Правила оповещений о работе платформы — </w:t>
+      </w:r>
+      <w:r>
+        <w:rPr>
+          <w:rFonts w:ascii="Consolas" w:hAnsi="Consolas"/>
+          <w:sz w:val="20"/>
+        </w:rPr>
+        <w:t>infra/prometheus/alert</w:t>
+      </w:r>
+      <w:r>
+        <w:rPr>
+          <w:rFonts w:ascii="Consolas" w:hAnsi="Consolas"/>
+          <w:sz w:val="20"/>
+        </w:rPr>
+        <w:t>s.yml</w:t>
+      </w:r>
+      <w:r>
+        <w:t xml:space="preserve">: сервис недоступен, задержка потока выше 300 с, </w:t>
+      </w:r>
+      <w:r>
+        <w:lastRenderedPageBreak/>
+        <w:t>неизвестные каналы в потоке, ошибки и медленные ответы API, сбои фоновых задач, подключения к базе. Они видны на панели «Оповещения» дашборда «Состояние системы» и на странице «Alerts» Prometheus. Файлы</w:t>
+      </w:r>
+      <w:r>
+        <w:t xml:space="preserve"> конфигурации смонтированы в контейнеры: после их правки — </w:t>
+      </w:r>
+      <w:r>
+        <w:rPr>
+          <w:rFonts w:ascii="Consolas" w:hAnsi="Consolas"/>
+          <w:sz w:val="20"/>
+        </w:rPr>
+        <w:t>docker compose restart prometheus grafana</w:t>
+      </w:r>
+      <w:r>
+        <w:t>.</w:t>
+      </w:r>
+    </w:p>
+    <w:p>
+      <w:pPr>
+        <w:pStyle w:val="21"/>
+      </w:pPr>
+      <w:bookmarkStart w:id="7" w:name="_Toc241594690"/>
+      <w:r>
+        <w:t>7. Учебный контур</w:t>
+      </w:r>
+      <w:bookmarkEnd w:id="7"/>
+    </w:p>
+    <w:p>
+      <w:r>
+        <w:t>Подсистема на том же адресе: https://forecast.corp.local/training/. Своя база, Redis, тема Kafka и help desk, боевые данные ей не видны.</w:t>
+      </w:r>
+      <w:r>
+        <w:t xml:space="preserve"> Вход и учётные записи общие с основной системой: учебный контур читает их из её базы (</w:t>
+      </w:r>
+      <w:r>
+        <w:rPr>
+          <w:rFonts w:ascii="Consolas" w:hAnsi="Consolas"/>
+          <w:sz w:val="20"/>
+        </w:rPr>
+        <w:t>IDENTITY_DATABASE_URL</w:t>
+      </w:r>
+      <w:r>
+        <w:t xml:space="preserve"> задан в </w:t>
+      </w:r>
+      <w:r>
+        <w:rPr>
+          <w:rFonts w:ascii="Consolas" w:hAnsi="Consolas"/>
+          <w:sz w:val="20"/>
+        </w:rPr>
+        <w:t>docker-compose.yml</w:t>
+      </w:r>
+      <w:r>
+        <w:t>), отдельно заводить пользователей не нужно (см. главу «Единая платформа»).</w:t>
+      </w:r>
+    </w:p>
+    <w:p>
+      <w:r>
+        <w:t>Учебный контур и симулятор датчиков поднимают</w:t>
+      </w:r>
+      <w:r>
+        <w:t>ся вместе с платформой (</w:t>
+      </w:r>
+      <w:r>
+        <w:rPr>
+          <w:rFonts w:ascii="Consolas" w:hAnsi="Consolas"/>
+          <w:sz w:val="20"/>
+        </w:rPr>
+        <w:t>docker compose up -d</w:t>
+      </w:r>
+      <w:r>
+        <w:t>), отдельно запускать их не нужно. Им нужно ещё около 1–1,5 ГБ памяти.</w:t>
+      </w:r>
+    </w:p>
     <w:p>
       <w:r>
         <w:rPr>
@@ -6756,10 +7005,7 @@
         <w:t>TRAINING_ADDRESS</w:t>
       </w:r>
       <w:r>
-        <w:t xml:space="preserve"> нужен, только чтобы старые </w:t>
-      </w:r>
-      <w:r>
-        <w:t xml:space="preserve">закладки </w:t>
+        <w:t xml:space="preserve"> нужен, только чтобы старые закладки </w:t>
       </w:r>
       <w:r>
         <w:rPr>
@@ -6804,7 +7050,17 @@
     </w:p>
     <w:p>
       <w:r>
-        <w:t xml:space="preserve">Симулятор датчиков слушает только </w:t>
+        <w:t xml:space="preserve">Веб-интерфейс симулятора датчиков открывается из меню учебного контура («Симулятор датчиков») по адресу </w:t>
+      </w:r>
+      <w:r>
+        <w:rPr>
+          <w:rFonts w:ascii="Consolas" w:hAnsi="Consolas"/>
+          <w:sz w:val="20"/>
+        </w:rPr>
+        <w:t>/simulator/</w:t>
+      </w:r>
+      <w:r>
+        <w:t xml:space="preserve"> — руководителю учений, вход той же учётной записью. Напрямую симулятор слушает только </w:t>
       </w:r>
       <w:r>
         <w:rPr>
@@ -6814,7 +7070,10 @@
         <w:t>127.0.0.1:8095</w:t>
       </w:r>
       <w:r>
-        <w:t xml:space="preserve">. Удалённо к нему подключаются через SSH-туннель: </w:t>
+        <w:t xml:space="preserve"> (с самого серв</w:t>
+      </w:r>
+      <w:r>
+        <w:t xml:space="preserve">ера или через SSH-туннель </w:t>
       </w:r>
       <w:r>
         <w:rPr>
@@ -6824,19 +7083,16 @@
         <w:t>ssh -L 8095:127.0.0.1:8095 &lt;сервер&gt;</w:t>
       </w:r>
       <w:r>
-        <w:t>.</w:t>
+        <w:t>).</w:t>
       </w:r>
     </w:p>
     <w:p>
       <w:pPr>
         <w:pStyle w:val="21"/>
       </w:pPr>
-      <w:bookmarkStart w:id="8" w:name="_Toc241494094"/>
-      <w:r>
-        <w:t xml:space="preserve">8. </w:t>
-      </w:r>
-      <w:r>
-        <w:t>Обновление</w:t>
+      <w:bookmarkStart w:id="8" w:name="_Toc241594691"/>
+      <w:r>
+        <w:t>8. Обновление</w:t>
       </w:r>
       <w:bookmarkEnd w:id="8"/>
     </w:p>
@@ -6887,14 +7143,15 @@
                 <w:sz w:val="17"/>
               </w:rPr>
               <w:br/>
-              <w:t xml:space="preserve">  docker tag collector-forecast/$i:local collector-forecast/$i:pre</w:t>
+              <w:t xml:space="preserve">  docker tag collector-forecast/$i:local collector-forecast/$i:prev</w:t>
             </w:r>
             <w:r>
               <w:rPr>
                 <w:rFonts w:ascii="Consolas" w:hAnsi="Consolas"/>
                 <w:sz w:val="17"/>
               </w:rPr>
-              <w:t>v</w:t>
+              <w:br/>
+              <w:t>done</w:t>
             </w:r>
             <w:r>
               <w:rPr>
@@ -6902,7 +7159,7 @@
                 <w:sz w:val="17"/>
               </w:rPr>
               <w:br/>
-              <w:t>done</w:t>
+              <w:t># вариант А: git pull &amp;&amp; docker compose build</w:t>
             </w:r>
             <w:r>
               <w:rPr>
@@ -6910,7 +7167,7 @@
                 <w:sz w:val="17"/>
               </w:rPr>
               <w:br/>
-              <w:t># вариант А: git pull &amp;&amp; docker compose build</w:t>
+              <w:t># вариант Б: docker load -i collector-images-&lt;новая версия&gt;.tar.gz и распаковать collector-src поверх</w:t>
             </w:r>
             <w:r>
               <w:rPr>
@@ -6918,15 +7175,14 @@
                 <w:sz w:val="17"/>
               </w:rPr>
               <w:br/>
-              <w:t># вариант Б: docker load -i collector-images-&lt;новая версия&gt;.tar.gz и распаковать collector-src поверх</w:t>
+              <w:t xml:space="preserve">docker compose up -d              </w:t>
             </w:r>
             <w:r>
               <w:rPr>
                 <w:rFonts w:ascii="Consolas" w:hAnsi="Consolas"/>
                 <w:sz w:val="17"/>
               </w:rPr>
-              <w:br/>
-              <w:t>docker compose up -d                                      # migrate применит новые миграции</w:t>
+              <w:t xml:space="preserve">                        # migrate применит новые миграции</w:t>
             </w:r>
             <w:r>
               <w:rPr>
@@ -6934,14 +7190,7 @@
                 <w:sz w:val="17"/>
               </w:rPr>
               <w:br/>
-              <w:t>infra/dep</w:t>
-            </w:r>
-            <w:r>
-              <w:rPr>
-                <w:rFonts w:ascii="Consolas" w:hAnsi="Consolas"/>
-                <w:sz w:val="17"/>
-              </w:rPr>
-              <w:t>loy/check.sh https://forecast.corp.local</w:t>
+              <w:t>infra/deploy/check.sh https://forecast.corp.local</w:t>
             </w:r>
           </w:p>
         </w:tc>
@@ -6950,7 +7199,6 @@
     <w:p/>
     <w:p>
       <w:r>
-        <w:lastRenderedPageBreak/>
         <w:t>Перерыв в работе — около минуты, пока пересоздаются контейнеры. Сторонние образы меняются только вместе с версией системы.</w:t>
       </w:r>
     </w:p>
@@ -6969,7 +7217,14 @@
           <w:rFonts w:ascii="Consolas" w:hAnsi="Consolas"/>
           <w:sz w:val="20"/>
         </w:rPr>
-        <w:t>:prev</w:t>
+        <w:t>:p</w:t>
+      </w:r>
+      <w:r>
+        <w:rPr>
+          <w:rFonts w:ascii="Consolas" w:hAnsi="Consolas"/>
+          <w:sz w:val="20"/>
+        </w:rPr>
+        <w:t>rev</w:t>
       </w:r>
       <w:r>
         <w:t xml:space="preserve"> → </w:t>
@@ -6992,19 +7247,19 @@
         <w:t>docker compose up -d</w:t>
       </w:r>
       <w:r>
-        <w:t>. Если новая версия при</w:t>
-      </w:r>
-      <w:r>
-        <w:t>менила миграции, базу восстанавливают из копии, сделанной перед обновлением. Порядок восстановления — в главе «Резервное копирование и восстановление» сопроводительной документации.</w:t>
+        <w:t>. Если новая версия применила миграции, базу восстанавливают из копии, сделанной перед обновлением. Порядок восстановления — в главе «Резервное копирование и восстановление» сопроводительной документации.</w:t>
       </w:r>
     </w:p>
     <w:p>
       <w:pPr>
         <w:pStyle w:val="21"/>
       </w:pPr>
-      <w:bookmarkStart w:id="9" w:name="_Toc241494095"/>
-      <w:r>
-        <w:t>9. Эксплуатация</w:t>
+      <w:bookmarkStart w:id="9" w:name="_Toc241594692"/>
+      <w:r>
+        <w:t>9. Эксп</w:t>
+      </w:r>
+      <w:r>
+        <w:t>луатация</w:t>
       </w:r>
       <w:bookmarkEnd w:id="9"/>
     </w:p>
@@ -7079,7 +7334,10 @@
         <w:t>.env</w:t>
       </w:r>
       <w:r>
-        <w:t xml:space="preserve"> копируются на отдельное хранилище средствами заказчика. Раз в квартал — пробное восстановление.</w:t>
+        <w:t xml:space="preserve"> копируются на отдельное хранилище средствами заказчика. Раз в квартал — пробное восст</w:t>
+      </w:r>
+      <w:r>
+        <w:t>ановление.</w:t>
       </w:r>
     </w:p>
     <w:p>
@@ -7103,10 +7361,7 @@
         <w:t>https://&lt;сервер&gt;/grafana/</w:t>
       </w:r>
       <w:r>
-        <w:t>: сис</w:t>
-      </w:r>
-      <w:r>
-        <w:t>темный дашборд (контейнеры, база, поток, очереди) и «Бизнес-показатели». Prometheus хранит метрики 15 суток.</w:t>
+        <w:t>: системный дашборд (контейнеры, база, поток, очереди) и «Бизнес-показатели». Prometheus хранит метрики 15 суток.</w:t>
       </w:r>
     </w:p>
     <w:p>
@@ -7130,7 +7385,10 @@
         <w:t>docker compose logs --since 1h &lt;сервис&gt;</w:t>
       </w:r>
       <w:r>
-        <w:t>. Журнал действий пользователей — в админке, «Журнал действий».</w:t>
+        <w:t>. Журнал действий пользо</w:t>
+      </w:r>
+      <w:r>
+        <w:t>вателей — в админке, «Журнал действий».</w:t>
       </w:r>
     </w:p>
     <w:p>
@@ -7144,10 +7402,7 @@
         <w:t>Расписание задач</w:t>
       </w:r>
       <w:r>
-        <w:t xml:space="preserve"> меняет</w:t>
-      </w:r>
-      <w:r>
-        <w:t>ся в админке («Periodic tasks») без перезапуска.</w:t>
+        <w:t xml:space="preserve"> меняется в админке («Periodic tasks») без перезапуска.</w:t>
       </w:r>
     </w:p>
     <w:p>
@@ -7158,6 +7413,7 @@
         <w:rPr>
           <w:b/>
         </w:rPr>
+        <w:lastRenderedPageBreak/>
         <w:t>Автозапуск.</w:t>
       </w:r>
       <w:r>
@@ -7171,7 +7427,10 @@
         <w:t>restart: unless-stopped</w:t>
       </w:r>
       <w:r>
-        <w:t xml:space="preserve"> поднимаются вместе с Docker после перезагрузки сервера. Нужно, чтобы сама служба Docker была включена: </w:t>
+        <w:t xml:space="preserve"> поднимаются вместе с Docker после перезагрузки сервера. Нужно, чтобы сама служба Docker была в</w:t>
+      </w:r>
+      <w:r>
+        <w:t xml:space="preserve">ключена: </w:t>
       </w:r>
       <w:r>
         <w:rPr>
@@ -7188,7 +7447,7 @@
       <w:pPr>
         <w:pStyle w:val="21"/>
       </w:pPr>
-      <w:bookmarkStart w:id="10" w:name="_Toc241494096"/>
+      <w:bookmarkStart w:id="10" w:name="_Toc241594693"/>
       <w:r>
         <w:t>10. Типичные проблемы</w:t>
       </w:r>
@@ -7363,13 +7622,7 @@
               <w:rPr>
                 <w:sz w:val="18"/>
               </w:rPr>
-              <w:t xml:space="preserve">Вход работает, но формы админки отвечают «CSRF </w:t>
-            </w:r>
-            <w:r>
-              <w:rPr>
-                <w:sz w:val="18"/>
-              </w:rPr>
-              <w:t>verification failed»</w:t>
+              <w:t>Вход работает, но формы админки отвечают «CSRF verification failed»</w:t>
             </w:r>
           </w:p>
         </w:tc>
@@ -7445,7 +7698,13 @@
               <w:rPr>
                 <w:sz w:val="18"/>
               </w:rPr>
-              <w:t xml:space="preserve">Вход через AD не проходит, в журнале backend </w:t>
+              <w:t xml:space="preserve">Вход через AD не </w:t>
+            </w:r>
+            <w:r>
+              <w:rPr>
+                <w:sz w:val="18"/>
+              </w:rPr>
+              <w:t xml:space="preserve">проходит, в журнале backend </w:t>
             </w:r>
             <w:r>
               <w:rPr>
@@ -7465,14 +7724,7 @@
                 <w:rFonts w:ascii="Consolas" w:hAnsi="Consolas"/>
                 <w:sz w:val="16"/>
               </w:rPr>
-              <w:t>certificate verify</w:t>
-            </w:r>
-            <w:r>
-              <w:rPr>
-                <w:rFonts w:ascii="Consolas" w:hAnsi="Consolas"/>
-                <w:sz w:val="16"/>
-              </w:rPr>
-              <w:t xml:space="preserve"> failed</w:t>
+              <w:t>certificate verify failed</w:t>
             </w:r>
           </w:p>
         </w:tc>
@@ -7580,7 +7832,13 @@
               <w:rPr>
                 <w:sz w:val="18"/>
               </w:rPr>
-              <w:t xml:space="preserve"> (ошибка CSP видна в консоли браузера)</w:t>
+              <w:t xml:space="preserve"> (</w:t>
+            </w:r>
+            <w:r>
+              <w:rPr>
+                <w:sz w:val="18"/>
+              </w:rPr>
+              <w:t>ошибка CSP видна в консоли браузера)</w:t>
             </w:r>
           </w:p>
         </w:tc>
@@ -7647,16 +7905,9 @@
           <w:p>
             <w:r>
               <w:rPr>
-                <w:rFonts w:ascii="Consolas" w:hAnsi="Consolas"/>
-                <w:sz w:val="16"/>
-              </w:rPr>
-              <w:t>import_history</w:t>
-            </w:r>
-            <w:r>
-              <w:rPr>
-                <w:sz w:val="18"/>
-              </w:rPr>
-              <w:t xml:space="preserve"> прерывается</w:t>
+                <w:sz w:val="18"/>
+              </w:rPr>
+              <w:t>Обучение: «Недостаточно истории для обучения»</w:t>
             </w:r>
           </w:p>
         </w:tc>
@@ -7669,7 +7920,13 @@
               <w:rPr>
                 <w:sz w:val="18"/>
               </w:rPr>
-              <w:t>мало памяти: нужно не меньше 8 ГБ для контейнеров</w:t>
+              <w:t>в ба</w:t>
+            </w:r>
+            <w:r>
+              <w:rPr>
+                <w:sz w:val="18"/>
+              </w:rPr>
+              <w:t>зе нет журналов за прошлые годы — загрузить их (раздел 5.1); до этого работает поставляемая модель</w:t>
             </w:r>
           </w:p>
         </w:tc>
@@ -7685,6 +7942,44 @@
           <w:p>
             <w:r>
               <w:rPr>
+                <w:rFonts w:ascii="Consolas" w:hAnsi="Consolas"/>
+                <w:sz w:val="16"/>
+              </w:rPr>
+              <w:t>import_history</w:t>
+            </w:r>
+            <w:r>
+              <w:rPr>
+                <w:sz w:val="18"/>
+              </w:rPr>
+              <w:t xml:space="preserve"> прерывается</w:t>
+            </w:r>
+          </w:p>
+        </w:tc>
+        <w:tc>
+          <w:tcPr>
+            <w:tcW w:w="4819" w:type="dxa"/>
+          </w:tcPr>
+          <w:p>
+            <w:r>
+              <w:rPr>
+                <w:sz w:val="18"/>
+              </w:rPr>
+              <w:t>мало памяти: нужно не меньше 8 ГБ для контейнеров</w:t>
+            </w:r>
+          </w:p>
+        </w:tc>
+      </w:tr>
+      <w:tr>
+        <w:trPr>
+          <w:jc w:val="center"/>
+        </w:trPr>
+        <w:tc>
+          <w:tcPr>
+            <w:tcW w:w="4819" w:type="dxa"/>
+          </w:tcPr>
+          <w:p>
+            <w:r>
+              <w:rPr>
                 <w:sz w:val="18"/>
               </w:rPr>
               <w:t>Интерфейс открывается, уведомления не приходят</w:t>
@@ -7700,13 +7995,13 @@
               <w:rPr>
                 <w:sz w:val="18"/>
               </w:rPr>
-              <w:t xml:space="preserve">прокси между пользователями и сервером режет </w:t>
-            </w:r>
-            <w:r>
-              <w:rPr>
-                <w:sz w:val="18"/>
-              </w:rPr>
-              <w:t>WebSocket (</w:t>
+              <w:t>прокси между пользователями и с</w:t>
+            </w:r>
+            <w:r>
+              <w:rPr>
+                <w:sz w:val="18"/>
+              </w:rPr>
+              <w:t>ервером режет WebSocket (</w:t>
             </w:r>
             <w:r>
               <w:rPr>
@@ -7730,9 +8025,8 @@
       <w:pPr>
         <w:pStyle w:val="21"/>
       </w:pPr>
-      <w:bookmarkStart w:id="11" w:name="_Toc241494097"/>
-      <w:r>
-        <w:lastRenderedPageBreak/>
+      <w:bookmarkStart w:id="11" w:name="_Toc241594694"/>
+      <w:r>
         <w:t>11. Перед вводом в эксплуатацию</w:t>
       </w:r>
       <w:bookmarkEnd w:id="11"/>
@@ -7793,10 +8087,7 @@
         <w:t>check.sh</w:t>
       </w:r>
       <w:r>
-        <w:t xml:space="preserve"> — все ст</w:t>
-      </w:r>
-      <w:r>
-        <w:t xml:space="preserve">роки </w:t>
+        <w:t xml:space="preserve"> — все строки </w:t>
       </w:r>
       <w:r>
         <w:rPr>
@@ -7840,10 +8131,10 @@
         <w:pStyle w:val="a"/>
       </w:pPr>
       <w:r>
-        <w:t>Порт 9094 открыт только для шлюза СМВУ, 443 (и 8443, есл</w:t>
-      </w:r>
-      <w:r>
-        <w:t>и оставлен для старых закладок) — только из сети предприятия или VPN.</w:t>
+        <w:t>Порт 9094 открыт только для шлюза СМВУ,</w:t>
+      </w:r>
+      <w:r>
+        <w:t xml:space="preserve"> 443 (и 8443, если оставлен для старых закладок) — только из сети предприятия или VPN.</w:t>
       </w:r>
     </w:p>
     <w:p>
@@ -7859,7 +8150,10 @@
         <w:pStyle w:val="a"/>
       </w:pPr>
       <w:r>
-        <w:t>Резервные копии уходят на отдельное хранилище и шифруются, пробное восстановление выполнено.</w:t>
+        <w:t xml:space="preserve">Резервные копии уходят на отдельное хранилище и шифруются, пробное </w:t>
+      </w:r>
+      <w:r>
+        <w:t>восстановление выполнено.</w:t>
       </w:r>
     </w:p>
     <w:p>
@@ -7867,10 +8161,7 @@
         <w:pStyle w:val="a"/>
       </w:pPr>
       <w:r>
-        <w:t>Решено, о</w:t>
-      </w:r>
-      <w:r>
-        <w:t xml:space="preserve">ткуда карта берёт подложку, и настроены </w:t>
+        <w:t xml:space="preserve">Решено, откуда карта берёт подложку, и настроены </w:t>
       </w:r>
       <w:r>
         <w:rPr>
@@ -19597,7 +19888,7 @@
     <w:autoRedefine/>
     <w:uiPriority w:val="39"/>
     <w:unhideWhenUsed/>
-    <w:rsid w:val="002338C0"/>
+    <w:rsid w:val="007E6F4A"/>
     <w:pPr>
       <w:spacing w:after="100"/>
     </w:pPr>
@@ -19609,7 +19900,7 @@
     <w:autoRedefine/>
     <w:uiPriority w:val="39"/>
     <w:unhideWhenUsed/>
-    <w:rsid w:val="002338C0"/>
+    <w:rsid w:val="007E6F4A"/>
     <w:pPr>
       <w:spacing w:after="100"/>
       <w:ind w:left="220"/>
@@ -19620,7 +19911,7 @@
     <w:basedOn w:val="a2"/>
     <w:uiPriority w:val="99"/>
     <w:unhideWhenUsed/>
-    <w:rsid w:val="002338C0"/>
+    <w:rsid w:val="007E6F4A"/>
     <w:rPr>
       <w:color w:val="0000FF" w:themeColor="hyperlink"/>
       <w:u w:val="single"/>

</xml_diff>